<commit_message>
Keep the earlier abstract and group the references as in the template
The abstract is the one from the first report with the new sentences
added, instead of a rewrite, and stays inside the template's 300 words.
References are grouped under the template's headings. The Word-file
builder no longer highlights unchanged sentences that sit between two new
ones, and the comments slide of the earlier deck names the response to
each comment.
</commit_message>
<xml_diff>
--- a/project_report_24bce2972_review2.docx
+++ b/project_report_24bce2972_review2.docx
@@ -13,7 +13,7 @@
           <w:noProof/>
         </w:rPr>
         <w:drawing>
-          <wp:inline distT="0" distB="0" distL="0" distR="0" wp14:anchorId="44E7D4ED" wp14:editId="0CE07113">
+          <wp:inline distT="0" distB="0" distL="0" distR="0" wp14:anchorId="680B6A64" wp14:editId="18FD70AC">
             <wp:extent cx="2400300" cy="664114"/>
             <wp:effectExtent l="0" t="0" r="0" b="0"/>
             <wp:docPr id="10" name="Picture" descr="image"/>
@@ -330,48 +330,34 @@
         <w:jc w:val="both"/>
       </w:pPr>
       <w:r>
-        <w:rPr>
-          <w:highlight w:val="yellow"/>
-        </w:rPr>
-        <w:t>Standard compilers apply a fixed chain of optimization passes, rarely confirming whether a specific transformation actually improved the code. We built a fully automated, multi-agent system that optimizes Three-Address Code (TAC) step by step. Instead of a static pipeline, an orchestrator loop analyzes the code and ranks the available opportunities, and an Optimization Specialist routes each step either to a rule-based engine or to a large language model (LLM). Three LLMs are supported behind one interface:</w:t>
-      </w:r>
-      <w:r>
-        <w:rPr>
-          <w:highlight w:val="yellow"/>
-        </w:rPr>
-        <w:t xml:space="preserve"> Google Gemini and Groq in the cloud, and a local model served by Ollama that works with no internet connection.</w:t>
-      </w:r>
-    </w:p>
-    <w:p>
-      <w:pPr>
-        <w:pStyle w:val="BodyText"/>
-        <w:spacing w:after="120" w:line="276" w:lineRule="auto"/>
-        <w:jc w:val="both"/>
-      </w:pPr>
-      <w:r>
-        <w:rPr>
-          <w:highlight w:val="yellow"/>
-        </w:rPr>
-        <w:t>To guarantee correctness, every proposed change must pass a strict dual-verification gate: differential testing on up to several hundred input sets, and symbolic polynomial equivalence for straight-line code. If a candidate passes, a static cost model evaluates the benefit, and the change is accepted only if the program becomes strictly cheaper.</w:t>
-      </w:r>
-    </w:p>
-    <w:p>
-      <w:pPr>
-        <w:pStyle w:val="BodyText"/>
-        <w:spacing w:after="120" w:line="276" w:lineRule="auto"/>
-        <w:jc w:val="both"/>
-      </w:pPr>
-      <w:r>
-        <w:rPr>
-          <w:highlight w:val="yellow"/>
-        </w:rPr>
-        <w:t>Tested on a dataset of 500 programs spanning seven structural categories, the rule-based agent alone achieved an 82.5% average cost reduction. Adding an LLM raised this to 91.5% with Gemini, 90.9% with Groq and 83.3% with the local model, largely by rewriting loops and conditionals that the rules cannot remove. The verifier blocked every incorrect LLM suggestion (26 from Gemini, 6 from Groq and 113 from the local model), so all four runs finished with a zero false-positive rate. The result shows that langua</w:t>
-      </w:r>
-      <w:r>
-        <w:rPr>
-          <w:highlight w:val="yellow"/>
-        </w:rPr>
-        <w:t>ge models can be integrated safely into compiler optimization, in the cloud or on a laptop, when every suggestion is verified before it is trusted.</w:t>
+        <w:t xml:space="preserve">Standard compilers apply a fixed chain of optimization passes, rarely confirming if a specific transformation actually improved the code’s efficiency. We built a fully automated, multi-agent system to optimize Three-Address Code (TAC) dynamically. Instead of a static pipeline, an orchestrator loop analyzes the code, ranks available opportunities, and proposes transformations using either a rule-based engine or a Google Gemini LLM fallback. </w:t>
+      </w:r>
+      <w:r>
+        <w:rPr>
+          <w:highlight w:val="yellow"/>
+        </w:rPr>
+        <w:t>Two more LLMs are supported behind the same interface: Groq in the cloud, and a local model served by Ollama that works with no internet connection.</w:t>
+      </w:r>
+      <w:r>
+        <w:t xml:space="preserve"> To guarantee correctness, every proposed change must pass a strict dual-verification gate: differential testing across 25+ input sets and symbolic polynomial equivalence for straight-line logic. If a candidate passes, a static cost model evaluates the precise performance benefit before accepting it. Tested on a dataset of 500 programs spanning seven structural categories, the rule-based agent alone achieved an 82.5% cost reduction. Integrating Gemini pushed this to 91.5%, largely by successfully rewriting </w:t>
+      </w:r>
+      <w:r>
+        <w:t xml:space="preserve">complex loops and conditionals that standard rules missed. </w:t>
+      </w:r>
+      <w:r>
+        <w:rPr>
+          <w:highlight w:val="yellow"/>
+        </w:rPr>
+        <w:t>Groq reached 90.9% and the local model 83.3%.</w:t>
+      </w:r>
+      <w:r>
+        <w:t xml:space="preserve"> The dual-verification system successfully blocked all 26 of Gemini’s incorrect suggestions, proving that language models can be safely integrated into compiler optimization when constrained by formal equivalence checks, resulting in a zero false-positive rate. </w:t>
+      </w:r>
+      <w:r>
+        <w:rPr>
+          <w:highlight w:val="yellow"/>
+        </w:rPr>
+        <w:t>It also blocked all 6 incorrect suggestions from Groq and all 113 from the local model, so every run finished with zero false positives.</w:t>
       </w:r>
     </w:p>
     <w:p>
@@ -415,7 +401,7 @@
       <w:r>
         <w:fldChar w:fldCharType="separate"/>
       </w:r>
-      <w:hyperlink w:anchor="_Toc242792979" w:history="1">
+      <w:hyperlink w:anchor="_Toc242796295" w:history="1">
         <w:r>
           <w:rPr>
             <w:rStyle w:val="Hyperlink"/>
@@ -442,7 +428,7 @@
             <w:noProof/>
             <w:webHidden/>
           </w:rPr>
-          <w:instrText xml:space="preserve"> PAGEREF _Toc242792979 \h </w:instrText>
+          <w:instrText xml:space="preserve"> PAGEREF _Toc242796295 \h </w:instrText>
         </w:r>
         <w:r>
           <w:rPr>
@@ -488,7 +474,7 @@
           <w14:ligatures w14:val="standardContextual"/>
         </w:rPr>
       </w:pPr>
-      <w:hyperlink w:anchor="_Toc242792980" w:history="1">
+      <w:hyperlink w:anchor="_Toc242796296" w:history="1">
         <w:r>
           <w:rPr>
             <w:rStyle w:val="Hyperlink"/>
@@ -516,7 +502,7 @@
             <w:noProof/>
             <w:webHidden/>
           </w:rPr>
-          <w:instrText xml:space="preserve"> PAGEREF _Toc242792980 \h </w:instrText>
+          <w:instrText xml:space="preserve"> PAGEREF _Toc242796296 \h </w:instrText>
         </w:r>
         <w:r>
           <w:rPr>
@@ -562,7 +548,7 @@
           <w14:ligatures w14:val="standardContextual"/>
         </w:rPr>
       </w:pPr>
-      <w:hyperlink w:anchor="_Toc242792981" w:history="1">
+      <w:hyperlink w:anchor="_Toc242796297" w:history="1">
         <w:r>
           <w:rPr>
             <w:rStyle w:val="Hyperlink"/>
@@ -590,7 +576,7 @@
             <w:noProof/>
             <w:webHidden/>
           </w:rPr>
-          <w:instrText xml:space="preserve"> PAGEREF _Toc242792981 \h </w:instrText>
+          <w:instrText xml:space="preserve"> PAGEREF _Toc242796297 \h </w:instrText>
         </w:r>
         <w:r>
           <w:rPr>
@@ -636,7 +622,7 @@
           <w14:ligatures w14:val="standardContextual"/>
         </w:rPr>
       </w:pPr>
-      <w:hyperlink w:anchor="_Toc242792982" w:history="1">
+      <w:hyperlink w:anchor="_Toc242796298" w:history="1">
         <w:r>
           <w:rPr>
             <w:rStyle w:val="Hyperlink"/>
@@ -664,7 +650,7 @@
             <w:noProof/>
             <w:webHidden/>
           </w:rPr>
-          <w:instrText xml:space="preserve"> PAGEREF _Toc242792982 \h </w:instrText>
+          <w:instrText xml:space="preserve"> PAGEREF _Toc242796298 \h </w:instrText>
         </w:r>
         <w:r>
           <w:rPr>
@@ -710,7 +696,7 @@
           <w14:ligatures w14:val="standardContextual"/>
         </w:rPr>
       </w:pPr>
-      <w:hyperlink w:anchor="_Toc242792983" w:history="1">
+      <w:hyperlink w:anchor="_Toc242796299" w:history="1">
         <w:r>
           <w:rPr>
             <w:rStyle w:val="Hyperlink"/>
@@ -737,7 +723,7 @@
             <w:noProof/>
             <w:webHidden/>
           </w:rPr>
-          <w:instrText xml:space="preserve"> PAGEREF _Toc242792983 \h </w:instrText>
+          <w:instrText xml:space="preserve"> PAGEREF _Toc242796299 \h </w:instrText>
         </w:r>
         <w:r>
           <w:rPr>
@@ -783,7 +769,7 @@
           <w14:ligatures w14:val="standardContextual"/>
         </w:rPr>
       </w:pPr>
-      <w:hyperlink w:anchor="_Toc242792984" w:history="1">
+      <w:hyperlink w:anchor="_Toc242796300" w:history="1">
         <w:r>
           <w:rPr>
             <w:rStyle w:val="Hyperlink"/>
@@ -811,7 +797,7 @@
             <w:noProof/>
             <w:webHidden/>
           </w:rPr>
-          <w:instrText xml:space="preserve"> PAGEREF _Toc242792984 \h </w:instrText>
+          <w:instrText xml:space="preserve"> PAGEREF _Toc242796300 \h </w:instrText>
         </w:r>
         <w:r>
           <w:rPr>
@@ -857,7 +843,7 @@
           <w14:ligatures w14:val="standardContextual"/>
         </w:rPr>
       </w:pPr>
-      <w:hyperlink w:anchor="_Toc242792985" w:history="1">
+      <w:hyperlink w:anchor="_Toc242796301" w:history="1">
         <w:r>
           <w:rPr>
             <w:rStyle w:val="Hyperlink"/>
@@ -884,7 +870,7 @@
             <w:noProof/>
             <w:webHidden/>
           </w:rPr>
-          <w:instrText xml:space="preserve"> PAGEREF _Toc242792985 \h </w:instrText>
+          <w:instrText xml:space="preserve"> PAGEREF _Toc242796301 \h </w:instrText>
         </w:r>
         <w:r>
           <w:rPr>
@@ -930,7 +916,7 @@
           <w14:ligatures w14:val="standardContextual"/>
         </w:rPr>
       </w:pPr>
-      <w:hyperlink w:anchor="_Toc242792986" w:history="1">
+      <w:hyperlink w:anchor="_Toc242796302" w:history="1">
         <w:r>
           <w:rPr>
             <w:rStyle w:val="Hyperlink"/>
@@ -957,7 +943,7 @@
             <w:noProof/>
             <w:webHidden/>
           </w:rPr>
-          <w:instrText xml:space="preserve"> PAGEREF _Toc242792986 \h </w:instrText>
+          <w:instrText xml:space="preserve"> PAGEREF _Toc242796302 \h </w:instrText>
         </w:r>
         <w:r>
           <w:rPr>
@@ -1003,7 +989,7 @@
           <w14:ligatures w14:val="standardContextual"/>
         </w:rPr>
       </w:pPr>
-      <w:hyperlink w:anchor="_Toc242792987" w:history="1">
+      <w:hyperlink w:anchor="_Toc242796303" w:history="1">
         <w:r>
           <w:rPr>
             <w:rStyle w:val="Hyperlink"/>
@@ -1030,7 +1016,7 @@
             <w:noProof/>
             <w:webHidden/>
           </w:rPr>
-          <w:instrText xml:space="preserve"> PAGEREF _Toc242792987 \h </w:instrText>
+          <w:instrText xml:space="preserve"> PAGEREF _Toc242796303 \h </w:instrText>
         </w:r>
         <w:r>
           <w:rPr>
@@ -1076,7 +1062,7 @@
           <w14:ligatures w14:val="standardContextual"/>
         </w:rPr>
       </w:pPr>
-      <w:hyperlink w:anchor="_Toc242792988" w:history="1">
+      <w:hyperlink w:anchor="_Toc242796304" w:history="1">
         <w:r>
           <w:rPr>
             <w:rStyle w:val="Hyperlink"/>
@@ -1103,7 +1089,7 @@
             <w:noProof/>
             <w:webHidden/>
           </w:rPr>
-          <w:instrText xml:space="preserve"> PAGEREF _Toc242792988 \h </w:instrText>
+          <w:instrText xml:space="preserve"> PAGEREF _Toc242796304 \h </w:instrText>
         </w:r>
         <w:r>
           <w:rPr>
@@ -1149,7 +1135,7 @@
           <w14:ligatures w14:val="standardContextual"/>
         </w:rPr>
       </w:pPr>
-      <w:hyperlink w:anchor="_Toc242792989" w:history="1">
+      <w:hyperlink w:anchor="_Toc242796305" w:history="1">
         <w:r>
           <w:rPr>
             <w:rStyle w:val="Hyperlink"/>
@@ -1176,7 +1162,7 @@
             <w:noProof/>
             <w:webHidden/>
           </w:rPr>
-          <w:instrText xml:space="preserve"> PAGEREF _Toc242792989 \h </w:instrText>
+          <w:instrText xml:space="preserve"> PAGEREF _Toc242796305 \h </w:instrText>
         </w:r>
         <w:r>
           <w:rPr>
@@ -1222,7 +1208,7 @@
           <w14:ligatures w14:val="standardContextual"/>
         </w:rPr>
       </w:pPr>
-      <w:hyperlink w:anchor="_Toc242792990" w:history="1">
+      <w:hyperlink w:anchor="_Toc242796306" w:history="1">
         <w:r>
           <w:rPr>
             <w:rStyle w:val="Hyperlink"/>
@@ -1250,7 +1236,7 @@
             <w:noProof/>
             <w:webHidden/>
           </w:rPr>
-          <w:instrText xml:space="preserve"> PAGEREF _Toc242792990 \h </w:instrText>
+          <w:instrText xml:space="preserve"> PAGEREF _Toc242796306 \h </w:instrText>
         </w:r>
         <w:r>
           <w:rPr>
@@ -1296,7 +1282,7 @@
           <w14:ligatures w14:val="standardContextual"/>
         </w:rPr>
       </w:pPr>
-      <w:hyperlink w:anchor="_Toc242792991" w:history="1">
+      <w:hyperlink w:anchor="_Toc242796307" w:history="1">
         <w:r>
           <w:rPr>
             <w:rStyle w:val="Hyperlink"/>
@@ -1324,7 +1310,7 @@
             <w:noProof/>
             <w:webHidden/>
           </w:rPr>
-          <w:instrText xml:space="preserve"> PAGEREF _Toc242792991 \h </w:instrText>
+          <w:instrText xml:space="preserve"> PAGEREF _Toc242796307 \h </w:instrText>
         </w:r>
         <w:r>
           <w:rPr>
@@ -1370,7 +1356,7 @@
           <w14:ligatures w14:val="standardContextual"/>
         </w:rPr>
       </w:pPr>
-      <w:hyperlink w:anchor="_Toc242792992" w:history="1">
+      <w:hyperlink w:anchor="_Toc242796308" w:history="1">
         <w:r>
           <w:rPr>
             <w:rStyle w:val="Hyperlink"/>
@@ -1398,7 +1384,7 @@
             <w:noProof/>
             <w:webHidden/>
           </w:rPr>
-          <w:instrText xml:space="preserve"> PAGEREF _Toc242792992 \h </w:instrText>
+          <w:instrText xml:space="preserve"> PAGEREF _Toc242796308 \h </w:instrText>
         </w:r>
         <w:r>
           <w:rPr>
@@ -1444,7 +1430,7 @@
           <w14:ligatures w14:val="standardContextual"/>
         </w:rPr>
       </w:pPr>
-      <w:hyperlink w:anchor="_Toc242792993" w:history="1">
+      <w:hyperlink w:anchor="_Toc242796309" w:history="1">
         <w:r>
           <w:rPr>
             <w:rStyle w:val="Hyperlink"/>
@@ -1472,7 +1458,7 @@
             <w:noProof/>
             <w:webHidden/>
           </w:rPr>
-          <w:instrText xml:space="preserve"> PAGEREF _Toc242792993 \h </w:instrText>
+          <w:instrText xml:space="preserve"> PAGEREF _Toc242796309 \h </w:instrText>
         </w:r>
         <w:r>
           <w:rPr>
@@ -1518,7 +1504,7 @@
           <w14:ligatures w14:val="standardContextual"/>
         </w:rPr>
       </w:pPr>
-      <w:hyperlink w:anchor="_Toc242792994" w:history="1">
+      <w:hyperlink w:anchor="_Toc242796310" w:history="1">
         <w:r>
           <w:rPr>
             <w:rStyle w:val="Hyperlink"/>
@@ -1545,7 +1531,7 @@
             <w:noProof/>
             <w:webHidden/>
           </w:rPr>
-          <w:instrText xml:space="preserve"> PAGEREF _Toc242792994 \h </w:instrText>
+          <w:instrText xml:space="preserve"> PAGEREF _Toc242796310 \h </w:instrText>
         </w:r>
         <w:r>
           <w:rPr>
@@ -1591,7 +1577,7 @@
           <w14:ligatures w14:val="standardContextual"/>
         </w:rPr>
       </w:pPr>
-      <w:hyperlink w:anchor="_Toc242792995" w:history="1">
+      <w:hyperlink w:anchor="_Toc242796311" w:history="1">
         <w:r>
           <w:rPr>
             <w:rStyle w:val="Hyperlink"/>
@@ -1619,7 +1605,7 @@
             <w:noProof/>
             <w:webHidden/>
           </w:rPr>
-          <w:instrText xml:space="preserve"> PAGEREF _Toc242792995 \h </w:instrText>
+          <w:instrText xml:space="preserve"> PAGEREF _Toc242796311 \h </w:instrText>
         </w:r>
         <w:r>
           <w:rPr>
@@ -1665,7 +1651,7 @@
           <w14:ligatures w14:val="standardContextual"/>
         </w:rPr>
       </w:pPr>
-      <w:hyperlink w:anchor="_Toc242792996" w:history="1">
+      <w:hyperlink w:anchor="_Toc242796312" w:history="1">
         <w:r>
           <w:rPr>
             <w:rStyle w:val="Hyperlink"/>
@@ -1692,7 +1678,7 @@
             <w:noProof/>
             <w:webHidden/>
           </w:rPr>
-          <w:instrText xml:space="preserve"> PAGEREF _Toc242792996 \h </w:instrText>
+          <w:instrText xml:space="preserve"> PAGEREF _Toc242796312 \h </w:instrText>
         </w:r>
         <w:r>
           <w:rPr>
@@ -1738,7 +1724,7 @@
           <w14:ligatures w14:val="standardContextual"/>
         </w:rPr>
       </w:pPr>
-      <w:hyperlink w:anchor="_Toc242792997" w:history="1">
+      <w:hyperlink w:anchor="_Toc242796313" w:history="1">
         <w:r>
           <w:rPr>
             <w:rStyle w:val="Hyperlink"/>
@@ -1765,7 +1751,7 @@
             <w:noProof/>
             <w:webHidden/>
           </w:rPr>
-          <w:instrText xml:space="preserve"> PAGEREF _Toc242792997 \h </w:instrText>
+          <w:instrText xml:space="preserve"> PAGEREF _Toc242796313 \h </w:instrText>
         </w:r>
         <w:r>
           <w:rPr>
@@ -1811,7 +1797,7 @@
           <w14:ligatures w14:val="standardContextual"/>
         </w:rPr>
       </w:pPr>
-      <w:hyperlink w:anchor="_Toc242792998" w:history="1">
+      <w:hyperlink w:anchor="_Toc242796314" w:history="1">
         <w:r>
           <w:rPr>
             <w:rStyle w:val="Hyperlink"/>
@@ -1839,7 +1825,7 @@
             <w:noProof/>
             <w:webHidden/>
           </w:rPr>
-          <w:instrText xml:space="preserve"> PAGEREF _Toc242792998 \h </w:instrText>
+          <w:instrText xml:space="preserve"> PAGEREF _Toc242796314 \h </w:instrText>
         </w:r>
         <w:r>
           <w:rPr>
@@ -1885,7 +1871,7 @@
           <w14:ligatures w14:val="standardContextual"/>
         </w:rPr>
       </w:pPr>
-      <w:hyperlink w:anchor="_Toc242792999" w:history="1">
+      <w:hyperlink w:anchor="_Toc242796315" w:history="1">
         <w:r>
           <w:rPr>
             <w:rStyle w:val="Hyperlink"/>
@@ -1912,7 +1898,7 @@
             <w:noProof/>
             <w:webHidden/>
           </w:rPr>
-          <w:instrText xml:space="preserve"> PAGEREF _Toc242792999 \h </w:instrText>
+          <w:instrText xml:space="preserve"> PAGEREF _Toc242796315 \h </w:instrText>
         </w:r>
         <w:r>
           <w:rPr>
@@ -1958,7 +1944,7 @@
           <w14:ligatures w14:val="standardContextual"/>
         </w:rPr>
       </w:pPr>
-      <w:hyperlink w:anchor="_Toc242793000" w:history="1">
+      <w:hyperlink w:anchor="_Toc242796316" w:history="1">
         <w:r>
           <w:rPr>
             <w:rStyle w:val="Hyperlink"/>
@@ -1985,7 +1971,7 @@
             <w:noProof/>
             <w:webHidden/>
           </w:rPr>
-          <w:instrText xml:space="preserve"> PAGEREF _Toc242793000 \h </w:instrText>
+          <w:instrText xml:space="preserve"> PAGEREF _Toc242796316 \h </w:instrText>
         </w:r>
         <w:r>
           <w:rPr>
@@ -2031,7 +2017,7 @@
           <w14:ligatures w14:val="standardContextual"/>
         </w:rPr>
       </w:pPr>
-      <w:hyperlink w:anchor="_Toc242793001" w:history="1">
+      <w:hyperlink w:anchor="_Toc242796317" w:history="1">
         <w:r>
           <w:rPr>
             <w:rStyle w:val="Hyperlink"/>
@@ -2058,7 +2044,7 @@
             <w:noProof/>
             <w:webHidden/>
           </w:rPr>
-          <w:instrText xml:space="preserve"> PAGEREF _Toc242793001 \h </w:instrText>
+          <w:instrText xml:space="preserve"> PAGEREF _Toc242796317 \h </w:instrText>
         </w:r>
         <w:r>
           <w:rPr>
@@ -2104,7 +2090,7 @@
           <w14:ligatures w14:val="standardContextual"/>
         </w:rPr>
       </w:pPr>
-      <w:hyperlink w:anchor="_Toc242793002" w:history="1">
+      <w:hyperlink w:anchor="_Toc242796318" w:history="1">
         <w:r>
           <w:rPr>
             <w:rStyle w:val="Hyperlink"/>
@@ -2132,7 +2118,7 @@
             <w:noProof/>
             <w:webHidden/>
           </w:rPr>
-          <w:instrText xml:space="preserve"> PAGEREF _Toc242793002 \h </w:instrText>
+          <w:instrText xml:space="preserve"> PAGEREF _Toc242796318 \h </w:instrText>
         </w:r>
         <w:r>
           <w:rPr>
@@ -2178,7 +2164,7 @@
           <w14:ligatures w14:val="standardContextual"/>
         </w:rPr>
       </w:pPr>
-      <w:hyperlink w:anchor="_Toc242793003" w:history="1">
+      <w:hyperlink w:anchor="_Toc242796319" w:history="1">
         <w:r>
           <w:rPr>
             <w:rStyle w:val="Hyperlink"/>
@@ -2206,7 +2192,7 @@
             <w:noProof/>
             <w:webHidden/>
           </w:rPr>
-          <w:instrText xml:space="preserve"> PAGEREF _Toc242793003 \h </w:instrText>
+          <w:instrText xml:space="preserve"> PAGEREF _Toc242796319 \h </w:instrText>
         </w:r>
         <w:r>
           <w:rPr>
@@ -2252,7 +2238,7 @@
           <w14:ligatures w14:val="standardContextual"/>
         </w:rPr>
       </w:pPr>
-      <w:hyperlink w:anchor="_Toc242793004" w:history="1">
+      <w:hyperlink w:anchor="_Toc242796320" w:history="1">
         <w:r>
           <w:rPr>
             <w:rStyle w:val="Hyperlink"/>
@@ -2280,7 +2266,7 @@
             <w:noProof/>
             <w:webHidden/>
           </w:rPr>
-          <w:instrText xml:space="preserve"> PAGEREF _Toc242793004 \h </w:instrText>
+          <w:instrText xml:space="preserve"> PAGEREF _Toc242796320 \h </w:instrText>
         </w:r>
         <w:r>
           <w:rPr>
@@ -2326,7 +2312,7 @@
           <w14:ligatures w14:val="standardContextual"/>
         </w:rPr>
       </w:pPr>
-      <w:hyperlink w:anchor="_Toc242793005" w:history="1">
+      <w:hyperlink w:anchor="_Toc242796321" w:history="1">
         <w:r>
           <w:rPr>
             <w:rStyle w:val="Hyperlink"/>
@@ -2354,7 +2340,7 @@
             <w:noProof/>
             <w:webHidden/>
           </w:rPr>
-          <w:instrText xml:space="preserve"> PAGEREF _Toc242793005 \h </w:instrText>
+          <w:instrText xml:space="preserve"> PAGEREF _Toc242796321 \h </w:instrText>
         </w:r>
         <w:r>
           <w:rPr>
@@ -2400,7 +2386,7 @@
           <w14:ligatures w14:val="standardContextual"/>
         </w:rPr>
       </w:pPr>
-      <w:hyperlink w:anchor="_Toc242793006" w:history="1">
+      <w:hyperlink w:anchor="_Toc242796322" w:history="1">
         <w:r>
           <w:rPr>
             <w:rStyle w:val="Hyperlink"/>
@@ -2428,7 +2414,7 @@
             <w:noProof/>
             <w:webHidden/>
           </w:rPr>
-          <w:instrText xml:space="preserve"> PAGEREF _Toc242793006 \h </w:instrText>
+          <w:instrText xml:space="preserve"> PAGEREF _Toc242796322 \h </w:instrText>
         </w:r>
         <w:r>
           <w:rPr>
@@ -2474,7 +2460,7 @@
           <w14:ligatures w14:val="standardContextual"/>
         </w:rPr>
       </w:pPr>
-      <w:hyperlink w:anchor="_Toc242793007" w:history="1">
+      <w:hyperlink w:anchor="_Toc242796323" w:history="1">
         <w:r>
           <w:rPr>
             <w:rStyle w:val="Hyperlink"/>
@@ -2501,7 +2487,7 @@
             <w:noProof/>
             <w:webHidden/>
           </w:rPr>
-          <w:instrText xml:space="preserve"> PAGEREF _Toc242793007 \h </w:instrText>
+          <w:instrText xml:space="preserve"> PAGEREF _Toc242796323 \h </w:instrText>
         </w:r>
         <w:r>
           <w:rPr>
@@ -2547,7 +2533,7 @@
           <w14:ligatures w14:val="standardContextual"/>
         </w:rPr>
       </w:pPr>
-      <w:hyperlink w:anchor="_Toc242793008" w:history="1">
+      <w:hyperlink w:anchor="_Toc242796324" w:history="1">
         <w:r>
           <w:rPr>
             <w:rStyle w:val="Hyperlink"/>
@@ -2574,7 +2560,7 @@
             <w:noProof/>
             <w:webHidden/>
           </w:rPr>
-          <w:instrText xml:space="preserve"> PAGEREF _Toc242793008 \h </w:instrText>
+          <w:instrText xml:space="preserve"> PAGEREF _Toc242796324 \h </w:instrText>
         </w:r>
         <w:r>
           <w:rPr>
@@ -2620,7 +2606,7 @@
           <w14:ligatures w14:val="standardContextual"/>
         </w:rPr>
       </w:pPr>
-      <w:hyperlink w:anchor="_Toc242793009" w:history="1">
+      <w:hyperlink w:anchor="_Toc242796325" w:history="1">
         <w:r>
           <w:rPr>
             <w:rStyle w:val="Hyperlink"/>
@@ -2647,7 +2633,7 @@
             <w:noProof/>
             <w:webHidden/>
           </w:rPr>
-          <w:instrText xml:space="preserve"> PAGEREF _Toc242793009 \h </w:instrText>
+          <w:instrText xml:space="preserve"> PAGEREF _Toc242796325 \h </w:instrText>
         </w:r>
         <w:r>
           <w:rPr>
@@ -2693,7 +2679,7 @@
           <w14:ligatures w14:val="standardContextual"/>
         </w:rPr>
       </w:pPr>
-      <w:hyperlink w:anchor="_Toc242793010" w:history="1">
+      <w:hyperlink w:anchor="_Toc242796326" w:history="1">
         <w:r>
           <w:rPr>
             <w:rStyle w:val="Hyperlink"/>
@@ -2720,7 +2706,7 @@
             <w:noProof/>
             <w:webHidden/>
           </w:rPr>
-          <w:instrText xml:space="preserve"> PAGEREF _Toc242793010 \h </w:instrText>
+          <w:instrText xml:space="preserve"> PAGEREF _Toc242796326 \h </w:instrText>
         </w:r>
         <w:r>
           <w:rPr>
@@ -2766,7 +2752,7 @@
           <w14:ligatures w14:val="standardContextual"/>
         </w:rPr>
       </w:pPr>
-      <w:hyperlink w:anchor="_Toc242793011" w:history="1">
+      <w:hyperlink w:anchor="_Toc242796327" w:history="1">
         <w:r>
           <w:rPr>
             <w:rStyle w:val="Hyperlink"/>
@@ -2794,7 +2780,7 @@
             <w:noProof/>
             <w:webHidden/>
           </w:rPr>
-          <w:instrText xml:space="preserve"> PAGEREF _Toc242793011 \h </w:instrText>
+          <w:instrText xml:space="preserve"> PAGEREF _Toc242796327 \h </w:instrText>
         </w:r>
         <w:r>
           <w:rPr>
@@ -2840,7 +2826,7 @@
           <w14:ligatures w14:val="standardContextual"/>
         </w:rPr>
       </w:pPr>
-      <w:hyperlink w:anchor="_Toc242793012" w:history="1">
+      <w:hyperlink w:anchor="_Toc242796328" w:history="1">
         <w:r>
           <w:rPr>
             <w:rStyle w:val="Hyperlink"/>
@@ -2867,7 +2853,7 @@
             <w:noProof/>
             <w:webHidden/>
           </w:rPr>
-          <w:instrText xml:space="preserve"> PAGEREF _Toc242793012 \h </w:instrText>
+          <w:instrText xml:space="preserve"> PAGEREF _Toc242796328 \h </w:instrText>
         </w:r>
         <w:r>
           <w:rPr>
@@ -2913,7 +2899,7 @@
           <w14:ligatures w14:val="standardContextual"/>
         </w:rPr>
       </w:pPr>
-      <w:hyperlink w:anchor="_Toc242793013" w:history="1">
+      <w:hyperlink w:anchor="_Toc242796329" w:history="1">
         <w:r>
           <w:rPr>
             <w:rStyle w:val="Hyperlink"/>
@@ -2940,7 +2926,7 @@
             <w:noProof/>
             <w:webHidden/>
           </w:rPr>
-          <w:instrText xml:space="preserve"> PAGEREF _Toc242793013 \h </w:instrText>
+          <w:instrText xml:space="preserve"> PAGEREF _Toc242796329 \h </w:instrText>
         </w:r>
         <w:r>
           <w:rPr>
@@ -2986,7 +2972,7 @@
           <w14:ligatures w14:val="standardContextual"/>
         </w:rPr>
       </w:pPr>
-      <w:hyperlink w:anchor="_Toc242793014" w:history="1">
+      <w:hyperlink w:anchor="_Toc242796330" w:history="1">
         <w:r>
           <w:rPr>
             <w:rStyle w:val="Hyperlink"/>
@@ -3013,7 +2999,7 @@
             <w:noProof/>
             <w:webHidden/>
           </w:rPr>
-          <w:instrText xml:space="preserve"> PAGEREF _Toc242793014 \h </w:instrText>
+          <w:instrText xml:space="preserve"> PAGEREF _Toc242796330 \h </w:instrText>
         </w:r>
         <w:r>
           <w:rPr>
@@ -3059,7 +3045,7 @@
           <w14:ligatures w14:val="standardContextual"/>
         </w:rPr>
       </w:pPr>
-      <w:hyperlink w:anchor="_Toc242793015" w:history="1">
+      <w:hyperlink w:anchor="_Toc242796331" w:history="1">
         <w:r>
           <w:rPr>
             <w:rStyle w:val="Hyperlink"/>
@@ -3088,7 +3074,7 @@
             <w:noProof/>
             <w:webHidden/>
           </w:rPr>
-          <w:instrText xml:space="preserve"> PAGEREF _Toc242793015 \h </w:instrText>
+          <w:instrText xml:space="preserve"> PAGEREF _Toc242796331 \h </w:instrText>
         </w:r>
         <w:r>
           <w:rPr>
@@ -3134,7 +3120,7 @@
           <w14:ligatures w14:val="standardContextual"/>
         </w:rPr>
       </w:pPr>
-      <w:hyperlink w:anchor="_Toc242793016" w:history="1">
+      <w:hyperlink w:anchor="_Toc242796332" w:history="1">
         <w:r>
           <w:rPr>
             <w:rStyle w:val="Hyperlink"/>
@@ -3176,7 +3162,7 @@
             <w:noProof/>
             <w:webHidden/>
           </w:rPr>
-          <w:instrText xml:space="preserve"> PAGEREF _Toc242793016 \h </w:instrText>
+          <w:instrText xml:space="preserve"> PAGEREF _Toc242796332 \h </w:instrText>
         </w:r>
         <w:r>
           <w:rPr>
@@ -3222,7 +3208,7 @@
           <w14:ligatures w14:val="standardContextual"/>
         </w:rPr>
       </w:pPr>
-      <w:hyperlink w:anchor="_Toc242793017" w:history="1">
+      <w:hyperlink w:anchor="_Toc242796333" w:history="1">
         <w:r>
           <w:rPr>
             <w:rStyle w:val="Hyperlink"/>
@@ -3264,7 +3250,7 @@
             <w:noProof/>
             <w:webHidden/>
           </w:rPr>
-          <w:instrText xml:space="preserve"> PAGEREF _Toc242793017 \h </w:instrText>
+          <w:instrText xml:space="preserve"> PAGEREF _Toc242796333 \h </w:instrText>
         </w:r>
         <w:r>
           <w:rPr>
@@ -3310,7 +3296,7 @@
           <w14:ligatures w14:val="standardContextual"/>
         </w:rPr>
       </w:pPr>
-      <w:hyperlink w:anchor="_Toc242793018" w:history="1">
+      <w:hyperlink w:anchor="_Toc242796334" w:history="1">
         <w:r>
           <w:rPr>
             <w:rStyle w:val="Hyperlink"/>
@@ -3352,7 +3338,7 @@
             <w:noProof/>
             <w:webHidden/>
           </w:rPr>
-          <w:instrText xml:space="preserve"> PAGEREF _Toc242793018 \h </w:instrText>
+          <w:instrText xml:space="preserve"> PAGEREF _Toc242796334 \h </w:instrText>
         </w:r>
         <w:r>
           <w:rPr>
@@ -3398,7 +3384,7 @@
           <w14:ligatures w14:val="standardContextual"/>
         </w:rPr>
       </w:pPr>
-      <w:hyperlink w:anchor="_Toc242793019" w:history="1">
+      <w:hyperlink w:anchor="_Toc242796335" w:history="1">
         <w:r>
           <w:rPr>
             <w:rStyle w:val="Hyperlink"/>
@@ -3426,7 +3412,7 @@
             <w:noProof/>
             <w:webHidden/>
           </w:rPr>
-          <w:instrText xml:space="preserve"> PAGEREF _Toc242793019 \h </w:instrText>
+          <w:instrText xml:space="preserve"> PAGEREF _Toc242796335 \h </w:instrText>
         </w:r>
         <w:r>
           <w:rPr>
@@ -3472,7 +3458,7 @@
           <w14:ligatures w14:val="standardContextual"/>
         </w:rPr>
       </w:pPr>
-      <w:hyperlink w:anchor="_Toc242793020" w:history="1">
+      <w:hyperlink w:anchor="_Toc242796336" w:history="1">
         <w:r>
           <w:rPr>
             <w:rStyle w:val="Hyperlink"/>
@@ -3517,7 +3503,7 @@
             <w:noProof/>
             <w:webHidden/>
           </w:rPr>
-          <w:instrText xml:space="preserve"> PAGEREF _Toc242793020 \h </w:instrText>
+          <w:instrText xml:space="preserve"> PAGEREF _Toc242796336 \h </w:instrText>
         </w:r>
         <w:r>
           <w:rPr>
@@ -3563,7 +3549,7 @@
           <w14:ligatures w14:val="standardContextual"/>
         </w:rPr>
       </w:pPr>
-      <w:hyperlink w:anchor="_Toc242793021" w:history="1">
+      <w:hyperlink w:anchor="_Toc242796337" w:history="1">
         <w:r>
           <w:rPr>
             <w:rStyle w:val="Hyperlink"/>
@@ -3591,7 +3577,7 @@
             <w:noProof/>
             <w:webHidden/>
           </w:rPr>
-          <w:instrText xml:space="preserve"> PAGEREF _Toc242793021 \h </w:instrText>
+          <w:instrText xml:space="preserve"> PAGEREF _Toc242796337 \h </w:instrText>
         </w:r>
         <w:r>
           <w:rPr>
@@ -3637,7 +3623,7 @@
           <w14:ligatures w14:val="standardContextual"/>
         </w:rPr>
       </w:pPr>
-      <w:hyperlink w:anchor="_Toc242793022" w:history="1">
+      <w:hyperlink w:anchor="_Toc242796338" w:history="1">
         <w:r>
           <w:rPr>
             <w:rStyle w:val="Hyperlink"/>
@@ -3665,7 +3651,7 @@
             <w:noProof/>
             <w:webHidden/>
           </w:rPr>
-          <w:instrText xml:space="preserve"> PAGEREF _Toc242793022 \h </w:instrText>
+          <w:instrText xml:space="preserve"> PAGEREF _Toc242796338 \h </w:instrText>
         </w:r>
         <w:r>
           <w:rPr>
@@ -3711,7 +3697,7 @@
           <w14:ligatures w14:val="standardContextual"/>
         </w:rPr>
       </w:pPr>
-      <w:hyperlink w:anchor="_Toc242793023" w:history="1">
+      <w:hyperlink w:anchor="_Toc242796339" w:history="1">
         <w:r>
           <w:rPr>
             <w:rStyle w:val="Hyperlink"/>
@@ -3738,7 +3724,7 @@
             <w:noProof/>
             <w:webHidden/>
           </w:rPr>
-          <w:instrText xml:space="preserve"> PAGEREF _Toc242793023 \h </w:instrText>
+          <w:instrText xml:space="preserve"> PAGEREF _Toc242796339 \h </w:instrText>
         </w:r>
         <w:r>
           <w:rPr>
@@ -3784,7 +3770,7 @@
           <w14:ligatures w14:val="standardContextual"/>
         </w:rPr>
       </w:pPr>
-      <w:hyperlink w:anchor="_Toc242793024" w:history="1">
+      <w:hyperlink w:anchor="_Toc242796340" w:history="1">
         <w:r>
           <w:rPr>
             <w:rStyle w:val="Hyperlink"/>
@@ -3812,7 +3798,7 @@
             <w:noProof/>
             <w:webHidden/>
           </w:rPr>
-          <w:instrText xml:space="preserve"> PAGEREF _Toc242793024 \h </w:instrText>
+          <w:instrText xml:space="preserve"> PAGEREF _Toc242796340 \h </w:instrText>
         </w:r>
         <w:r>
           <w:rPr>
@@ -3858,7 +3844,7 @@
           <w14:ligatures w14:val="standardContextual"/>
         </w:rPr>
       </w:pPr>
-      <w:hyperlink w:anchor="_Toc242793025" w:history="1">
+      <w:hyperlink w:anchor="_Toc242796341" w:history="1">
         <w:r>
           <w:rPr>
             <w:rStyle w:val="Hyperlink"/>
@@ -3886,7 +3872,7 @@
             <w:noProof/>
             <w:webHidden/>
           </w:rPr>
-          <w:instrText xml:space="preserve"> PAGEREF _Toc242793025 \h </w:instrText>
+          <w:instrText xml:space="preserve"> PAGEREF _Toc242796341 \h </w:instrText>
         </w:r>
         <w:r>
           <w:rPr>
@@ -3932,7 +3918,7 @@
           <w14:ligatures w14:val="standardContextual"/>
         </w:rPr>
       </w:pPr>
-      <w:hyperlink w:anchor="_Toc242793026" w:history="1">
+      <w:hyperlink w:anchor="_Toc242796342" w:history="1">
         <w:r>
           <w:rPr>
             <w:rStyle w:val="Hyperlink"/>
@@ -3960,7 +3946,7 @@
             <w:noProof/>
             <w:webHidden/>
           </w:rPr>
-          <w:instrText xml:space="preserve"> PAGEREF _Toc242793026 \h </w:instrText>
+          <w:instrText xml:space="preserve"> PAGEREF _Toc242796342 \h </w:instrText>
         </w:r>
         <w:r>
           <w:rPr>
@@ -4006,7 +3992,7 @@
           <w14:ligatures w14:val="standardContextual"/>
         </w:rPr>
       </w:pPr>
-      <w:hyperlink w:anchor="_Toc242793027" w:history="1">
+      <w:hyperlink w:anchor="_Toc242796343" w:history="1">
         <w:r>
           <w:rPr>
             <w:rStyle w:val="Hyperlink"/>
@@ -4034,7 +4020,7 @@
             <w:noProof/>
             <w:webHidden/>
           </w:rPr>
-          <w:instrText xml:space="preserve"> PAGEREF _Toc242793027 \h </w:instrText>
+          <w:instrText xml:space="preserve"> PAGEREF _Toc242796343 \h </w:instrText>
         </w:r>
         <w:r>
           <w:rPr>
@@ -4080,7 +4066,7 @@
           <w14:ligatures w14:val="standardContextual"/>
         </w:rPr>
       </w:pPr>
-      <w:hyperlink w:anchor="_Toc242793028" w:history="1">
+      <w:hyperlink w:anchor="_Toc242796344" w:history="1">
         <w:r>
           <w:rPr>
             <w:rStyle w:val="Hyperlink"/>
@@ -4107,7 +4093,7 @@
             <w:noProof/>
             <w:webHidden/>
           </w:rPr>
-          <w:instrText xml:space="preserve"> PAGEREF _Toc242793028 \h </w:instrText>
+          <w:instrText xml:space="preserve"> PAGEREF _Toc242796344 \h </w:instrText>
         </w:r>
         <w:r>
           <w:rPr>
@@ -4153,7 +4139,7 @@
           <w14:ligatures w14:val="standardContextual"/>
         </w:rPr>
       </w:pPr>
-      <w:hyperlink w:anchor="_Toc242793029" w:history="1">
+      <w:hyperlink w:anchor="_Toc242796345" w:history="1">
         <w:r>
           <w:rPr>
             <w:rStyle w:val="Hyperlink"/>
@@ -4180,7 +4166,7 @@
             <w:noProof/>
             <w:webHidden/>
           </w:rPr>
-          <w:instrText xml:space="preserve"> PAGEREF _Toc242793029 \h </w:instrText>
+          <w:instrText xml:space="preserve"> PAGEREF _Toc242796345 \h </w:instrText>
         </w:r>
         <w:r>
           <w:rPr>
@@ -4226,7 +4212,7 @@
           <w14:ligatures w14:val="standardContextual"/>
         </w:rPr>
       </w:pPr>
-      <w:hyperlink w:anchor="_Toc242793030" w:history="1">
+      <w:hyperlink w:anchor="_Toc242796346" w:history="1">
         <w:r>
           <w:rPr>
             <w:rStyle w:val="Hyperlink"/>
@@ -4253,7 +4239,7 @@
             <w:noProof/>
             <w:webHidden/>
           </w:rPr>
-          <w:instrText xml:space="preserve"> PAGEREF _Toc242793030 \h </w:instrText>
+          <w:instrText xml:space="preserve"> PAGEREF _Toc242796346 \h </w:instrText>
         </w:r>
         <w:r>
           <w:rPr>
@@ -4299,7 +4285,7 @@
           <w14:ligatures w14:val="standardContextual"/>
         </w:rPr>
       </w:pPr>
-      <w:hyperlink w:anchor="_Toc242793031" w:history="1">
+      <w:hyperlink w:anchor="_Toc242796347" w:history="1">
         <w:r>
           <w:rPr>
             <w:rStyle w:val="Hyperlink"/>
@@ -4326,7 +4312,7 @@
             <w:noProof/>
             <w:webHidden/>
           </w:rPr>
-          <w:instrText xml:space="preserve"> PAGEREF _Toc242793031 \h </w:instrText>
+          <w:instrText xml:space="preserve"> PAGEREF _Toc242796347 \h </w:instrText>
         </w:r>
         <w:r>
           <w:rPr>
@@ -4372,7 +4358,7 @@
           <w14:ligatures w14:val="standardContextual"/>
         </w:rPr>
       </w:pPr>
-      <w:hyperlink w:anchor="_Toc242793032" w:history="1">
+      <w:hyperlink w:anchor="_Toc242796348" w:history="1">
         <w:r>
           <w:rPr>
             <w:rStyle w:val="Hyperlink"/>
@@ -4399,7 +4385,7 @@
             <w:noProof/>
             <w:webHidden/>
           </w:rPr>
-          <w:instrText xml:space="preserve"> PAGEREF _Toc242793032 \h </w:instrText>
+          <w:instrText xml:space="preserve"> PAGEREF _Toc242796348 \h </w:instrText>
         </w:r>
         <w:r>
           <w:rPr>
@@ -4445,7 +4431,7 @@
           <w14:ligatures w14:val="standardContextual"/>
         </w:rPr>
       </w:pPr>
-      <w:hyperlink w:anchor="_Toc242793033" w:history="1">
+      <w:hyperlink w:anchor="_Toc242796349" w:history="1">
         <w:r>
           <w:rPr>
             <w:rStyle w:val="Hyperlink"/>
@@ -4472,7 +4458,7 @@
             <w:noProof/>
             <w:webHidden/>
           </w:rPr>
-          <w:instrText xml:space="preserve"> PAGEREF _Toc242793033 \h </w:instrText>
+          <w:instrText xml:space="preserve"> PAGEREF _Toc242796349 \h </w:instrText>
         </w:r>
         <w:r>
           <w:rPr>
@@ -4518,7 +4504,7 @@
           <w14:ligatures w14:val="standardContextual"/>
         </w:rPr>
       </w:pPr>
-      <w:hyperlink w:anchor="_Toc242793034" w:history="1">
+      <w:hyperlink w:anchor="_Toc242796350" w:history="1">
         <w:r>
           <w:rPr>
             <w:rStyle w:val="Hyperlink"/>
@@ -4546,7 +4532,7 @@
             <w:noProof/>
             <w:webHidden/>
           </w:rPr>
-          <w:instrText xml:space="preserve"> PAGEREF _Toc242793034 \h </w:instrText>
+          <w:instrText xml:space="preserve"> PAGEREF _Toc242796350 \h </w:instrText>
         </w:r>
         <w:r>
           <w:rPr>
@@ -4592,7 +4578,7 @@
           <w14:ligatures w14:val="standardContextual"/>
         </w:rPr>
       </w:pPr>
-      <w:hyperlink w:anchor="_Toc242793035" w:history="1">
+      <w:hyperlink w:anchor="_Toc242796351" w:history="1">
         <w:r>
           <w:rPr>
             <w:rStyle w:val="Hyperlink"/>
@@ -4620,7 +4606,7 @@
             <w:noProof/>
             <w:webHidden/>
           </w:rPr>
-          <w:instrText xml:space="preserve"> PAGEREF _Toc242793035 \h </w:instrText>
+          <w:instrText xml:space="preserve"> PAGEREF _Toc242796351 \h </w:instrText>
         </w:r>
         <w:r>
           <w:rPr>
@@ -4666,7 +4652,7 @@
           <w14:ligatures w14:val="standardContextual"/>
         </w:rPr>
       </w:pPr>
-      <w:hyperlink w:anchor="_Toc242793036" w:history="1">
+      <w:hyperlink w:anchor="_Toc242796352" w:history="1">
         <w:r>
           <w:rPr>
             <w:rStyle w:val="Hyperlink"/>
@@ -4694,7 +4680,7 @@
             <w:noProof/>
             <w:webHidden/>
           </w:rPr>
-          <w:instrText xml:space="preserve"> PAGEREF _Toc242793036 \h </w:instrText>
+          <w:instrText xml:space="preserve"> PAGEREF _Toc242796352 \h </w:instrText>
         </w:r>
         <w:r>
           <w:rPr>
@@ -4740,7 +4726,7 @@
           <w14:ligatures w14:val="standardContextual"/>
         </w:rPr>
       </w:pPr>
-      <w:hyperlink w:anchor="_Toc242793037" w:history="1">
+      <w:hyperlink w:anchor="_Toc242796353" w:history="1">
         <w:r>
           <w:rPr>
             <w:rStyle w:val="Hyperlink"/>
@@ -4768,7 +4754,7 @@
             <w:noProof/>
             <w:webHidden/>
           </w:rPr>
-          <w:instrText xml:space="preserve"> PAGEREF _Toc242793037 \h </w:instrText>
+          <w:instrText xml:space="preserve"> PAGEREF _Toc242796353 \h </w:instrText>
         </w:r>
         <w:r>
           <w:rPr>
@@ -4814,7 +4800,7 @@
           <w14:ligatures w14:val="standardContextual"/>
         </w:rPr>
       </w:pPr>
-      <w:hyperlink w:anchor="_Toc242793038" w:history="1">
+      <w:hyperlink w:anchor="_Toc242796354" w:history="1">
         <w:r>
           <w:rPr>
             <w:rStyle w:val="Hyperlink"/>
@@ -4842,7 +4828,7 @@
             <w:noProof/>
             <w:webHidden/>
           </w:rPr>
-          <w:instrText xml:space="preserve"> PAGEREF _Toc242793038 \h </w:instrText>
+          <w:instrText xml:space="preserve"> PAGEREF _Toc242796354 \h </w:instrText>
         </w:r>
         <w:r>
           <w:rPr>
@@ -4888,7 +4874,7 @@
           <w14:ligatures w14:val="standardContextual"/>
         </w:rPr>
       </w:pPr>
-      <w:hyperlink w:anchor="_Toc242793039" w:history="1">
+      <w:hyperlink w:anchor="_Toc242796355" w:history="1">
         <w:r>
           <w:rPr>
             <w:rStyle w:val="Hyperlink"/>
@@ -4916,7 +4902,7 @@
             <w:noProof/>
             <w:webHidden/>
           </w:rPr>
-          <w:instrText xml:space="preserve"> PAGEREF _Toc242793039 \h </w:instrText>
+          <w:instrText xml:space="preserve"> PAGEREF _Toc242796355 \h </w:instrText>
         </w:r>
         <w:r>
           <w:rPr>
@@ -4964,7 +4950,7 @@
         <w:jc w:val="center"/>
       </w:pPr>
       <w:bookmarkStart w:id="0" w:name="_introduction"/>
-      <w:bookmarkStart w:id="1" w:name="_Toc242792979"/>
+      <w:bookmarkStart w:id="1" w:name="_Toc242796295"/>
       <w:r>
         <w:rPr>
           <w:rStyle w:val="SectionNumber"/>
@@ -4990,7 +4976,7 @@
         <w:spacing w:before="240" w:after="120" w:line="360" w:lineRule="auto"/>
       </w:pPr>
       <w:bookmarkStart w:id="2" w:name="_background"/>
-      <w:bookmarkStart w:id="3" w:name="_Toc242792980"/>
+      <w:bookmarkStart w:id="3" w:name="_Toc242796296"/>
       <w:r>
         <w:rPr>
           <w:rStyle w:val="SectionNumber"/>
@@ -5102,7 +5088,7 @@
         <w:spacing w:before="240" w:after="120" w:line="360" w:lineRule="auto"/>
       </w:pPr>
       <w:bookmarkStart w:id="4" w:name="_motivation"/>
-      <w:bookmarkStart w:id="5" w:name="_Toc242792981"/>
+      <w:bookmarkStart w:id="5" w:name="_Toc242796297"/>
       <w:r>
         <w:rPr>
           <w:rStyle w:val="SectionNumber"/>
@@ -5161,14 +5147,20 @@
         <w:rPr>
           <w:highlight w:val="yellow"/>
         </w:rPr>
-        <w:t xml:space="preserve">The gap we wanted to fill was the absence of any system that pairs an LLM proposer with a verification gate. LLMs hallucinate; that is well documented. But if every </w:t>
-      </w:r>
-      <w:r>
-        <w:rPr>
-          <w:highlight w:val="yellow"/>
-        </w:rPr>
+        <w:t>The gap we wanted to fill was the absence of any system that pairs an LLM proposer with a verification gate.</w:t>
+      </w:r>
+      <w:r>
+        <w:t xml:space="preserve"> LLMs hallucinate; that is well documented. But if every </w:t>
+      </w:r>
+      <w:r>
         <w:lastRenderedPageBreak/>
-        <w:t>suggestion is tested before it is accepted, the hallucination rate becomes a measurable rejection rate rather than a silent bug rate. We thought that would be an interesting thing to quantify, and the results bore it out: 7.65% of Gemini’s proposals, 1.9% of Groq’s and 57% of the local model’s turned out to be wrong, and the verifier caught all of them.</w:t>
+        <w:t xml:space="preserve">suggestion is tested before it is accepted, the hallucination rate becomes a measurable rejection rate rather than a silent bug rate. </w:t>
+      </w:r>
+      <w:r>
+        <w:rPr>
+          <w:highlight w:val="yellow"/>
+        </w:rPr>
+        <w:t>We thought that would be an interesting thing to quantify, and the results bore it out: 7.65% of Gemini’s proposals, 1.9% of Groq’s and 57% of the local model’s turned out to be wrong, and the verifier caught all of them.</w:t>
       </w:r>
     </w:p>
     <w:p>
@@ -5177,7 +5169,7 @@
         <w:spacing w:before="240" w:after="120" w:line="360" w:lineRule="auto"/>
       </w:pPr>
       <w:bookmarkStart w:id="6" w:name="_17d6ce0b10bf8fb112948ec43a9be41890987c5"/>
-      <w:bookmarkStart w:id="7" w:name="_Toc242792982"/>
+      <w:bookmarkStart w:id="7" w:name="_Toc242796298"/>
       <w:r>
         <w:rPr>
           <w:rStyle w:val="SectionNumber"/>
@@ -5596,7 +5588,7 @@
         <w:jc w:val="center"/>
       </w:pPr>
       <w:bookmarkStart w:id="8" w:name="_9be77a5f053310aa635a18bb714240a38d3b967"/>
-      <w:bookmarkStart w:id="9" w:name="_Toc242792983"/>
+      <w:bookmarkStart w:id="9" w:name="_Toc242796299"/>
       <w:r>
         <w:rPr>
           <w:rStyle w:val="SectionNumber"/>
@@ -5622,7 +5614,7 @@
         <w:spacing w:before="240" w:after="120" w:line="360" w:lineRule="auto"/>
       </w:pPr>
       <w:bookmarkStart w:id="10" w:name="_864628083f114e19af9c93fe562a1c7b2d35508"/>
-      <w:bookmarkStart w:id="11" w:name="_Toc242792984"/>
+      <w:bookmarkStart w:id="11" w:name="_Toc242796300"/>
       <w:r>
         <w:rPr>
           <w:rStyle w:val="SectionNumber"/>
@@ -5645,7 +5637,7 @@
         <w:spacing w:before="240" w:after="120" w:line="360" w:lineRule="auto"/>
       </w:pPr>
       <w:bookmarkStart w:id="12" w:name="_e0207ec78b9c89fea62976c42935be3ee4ee003"/>
-      <w:bookmarkStart w:id="13" w:name="_Toc242792985"/>
+      <w:bookmarkStart w:id="13" w:name="_Toc242796301"/>
       <w:r>
         <w:rPr>
           <w:rStyle w:val="SectionNumber"/>
@@ -5687,7 +5679,7 @@
         <w:spacing w:before="240" w:after="120" w:line="360" w:lineRule="auto"/>
       </w:pPr>
       <w:bookmarkStart w:id="14" w:name="_3ff33244d364ef2b820695fa40aba140825c1ed"/>
-      <w:bookmarkStart w:id="15" w:name="_Toc242792986"/>
+      <w:bookmarkStart w:id="15" w:name="_Toc242796302"/>
       <w:r>
         <w:rPr>
           <w:rStyle w:val="SectionNumber"/>
@@ -5719,7 +5711,7 @@
         <w:spacing w:before="240" w:after="120" w:line="360" w:lineRule="auto"/>
       </w:pPr>
       <w:bookmarkStart w:id="16" w:name="_a77da33c8a3a3fbd2816370f68b19b9451ab311"/>
-      <w:bookmarkStart w:id="17" w:name="_Toc242792987"/>
+      <w:bookmarkStart w:id="17" w:name="_Toc242796303"/>
       <w:r>
         <w:rPr>
           <w:rStyle w:val="SectionNumber"/>
@@ -5752,7 +5744,7 @@
         <w:spacing w:before="240" w:after="120" w:line="360" w:lineRule="auto"/>
       </w:pPr>
       <w:bookmarkStart w:id="18" w:name="_ff2bb32f1f4da58fb20168f5e6e96a1ca81d194"/>
-      <w:bookmarkStart w:id="19" w:name="_Toc242792988"/>
+      <w:bookmarkStart w:id="19" w:name="_Toc242796304"/>
       <w:r>
         <w:rPr>
           <w:rStyle w:val="SectionNumber"/>
@@ -5790,7 +5782,7 @@
         <w:spacing w:before="240" w:after="120" w:line="360" w:lineRule="auto"/>
       </w:pPr>
       <w:bookmarkStart w:id="20" w:name="_9de57162f0efca228c16b2e38d5a662953a5e57"/>
-      <w:bookmarkStart w:id="21" w:name="_Toc242792989"/>
+      <w:bookmarkStart w:id="21" w:name="_Toc242796305"/>
       <w:r>
         <w:rPr>
           <w:rStyle w:val="SectionNumber"/>
@@ -5822,7 +5814,7 @@
         <w:spacing w:before="240" w:after="120" w:line="360" w:lineRule="auto"/>
       </w:pPr>
       <w:bookmarkStart w:id="22" w:name="_24bec67977fa19c36ce1033f5369e15c90b5f1c"/>
-      <w:bookmarkStart w:id="23" w:name="_Toc242792990"/>
+      <w:bookmarkStart w:id="23" w:name="_Toc242796306"/>
       <w:r>
         <w:rPr>
           <w:rStyle w:val="SectionNumber"/>
@@ -5943,7 +5935,7 @@
         <w:spacing w:before="240" w:after="120" w:line="360" w:lineRule="auto"/>
       </w:pPr>
       <w:bookmarkStart w:id="24" w:name="_objectives"/>
-      <w:bookmarkStart w:id="25" w:name="_Toc242792991"/>
+      <w:bookmarkStart w:id="25" w:name="_Toc242796307"/>
       <w:r>
         <w:rPr>
           <w:rStyle w:val="SectionNumber"/>
@@ -6108,7 +6100,7 @@
         <w:spacing w:before="240" w:after="120" w:line="360" w:lineRule="auto"/>
       </w:pPr>
       <w:bookmarkStart w:id="26" w:name="_80405804e065f2c789b9d50555f9bde4550fee8"/>
-      <w:bookmarkStart w:id="27" w:name="_Toc242792992"/>
+      <w:bookmarkStart w:id="27" w:name="_Toc242796308"/>
       <w:r>
         <w:rPr>
           <w:rStyle w:val="SectionNumber"/>
@@ -6150,7 +6142,7 @@
         <w:spacing w:before="240" w:after="120" w:line="360" w:lineRule="auto"/>
       </w:pPr>
       <w:bookmarkStart w:id="28" w:name="_8b312eb817b599d89672f5e43e1bb46c3321821"/>
-      <w:bookmarkStart w:id="29" w:name="_Toc242792993"/>
+      <w:bookmarkStart w:id="29" w:name="_Toc242796309"/>
       <w:r>
         <w:rPr>
           <w:rStyle w:val="SectionNumber"/>
@@ -6929,7 +6921,7 @@
         <w:jc w:val="center"/>
       </w:pPr>
       <w:bookmarkStart w:id="31" w:name="_325aba9665c3a440e9572f12a75cfcf02623197"/>
-      <w:bookmarkStart w:id="32" w:name="_Toc242792994"/>
+      <w:bookmarkStart w:id="32" w:name="_Toc242796310"/>
       <w:r>
         <w:rPr>
           <w:rStyle w:val="SectionNumber"/>
@@ -6955,7 +6947,7 @@
         <w:spacing w:before="240" w:after="120" w:line="360" w:lineRule="auto"/>
       </w:pPr>
       <w:bookmarkStart w:id="33" w:name="_requirements"/>
-      <w:bookmarkStart w:id="34" w:name="_Toc242792995"/>
+      <w:bookmarkStart w:id="34" w:name="_Toc242796311"/>
       <w:r>
         <w:rPr>
           <w:rStyle w:val="SectionNumber"/>
@@ -6978,7 +6970,7 @@
         <w:spacing w:before="240" w:after="120" w:line="360" w:lineRule="auto"/>
       </w:pPr>
       <w:bookmarkStart w:id="35" w:name="_e943878e1ff56977fd09a3c44144373c05a6731"/>
-      <w:bookmarkStart w:id="36" w:name="_Toc242792996"/>
+      <w:bookmarkStart w:id="36" w:name="_Toc242796312"/>
       <w:r>
         <w:rPr>
           <w:rStyle w:val="SectionNumber"/>
@@ -7061,7 +7053,16 @@
         <w:rPr>
           <w:highlight w:val="yellow"/>
         </w:rPr>
-        <w:t>The Optimization Specialist shall route each step to the rule-based optimizer or to an LLM and record the reason. The rule-based optimizer shall apply exactly one transformation per iteration. The LLM optimizer shall, when invoked, send the current TAC to the configured model (Gemini, Groq or a local Ollama model) and parse the returned candidate.</w:t>
+        <w:t>The Optimization Specialist shall route each step to the rule-based optimizer or to an LLM and record the reason.</w:t>
+      </w:r>
+      <w:r>
+        <w:t xml:space="preserve"> The rule-based optimizer shall apply exactly one transformation per iteration. </w:t>
+      </w:r>
+      <w:r>
+        <w:rPr>
+          <w:highlight w:val="yellow"/>
+        </w:rPr>
+        <w:t>The LLM optimizer shall, when invoked, send the current TAC to the configured model (Gemini, Groq or a local Ollama model) and parse the returned candidate.</w:t>
       </w:r>
     </w:p>
     <w:p>
@@ -7082,10 +7083,7 @@
         <w:t>Dual verification:</w:t>
       </w:r>
       <w:r>
-        <w:t xml:space="preserve"> </w:t>
-      </w:r>
-      <w:r>
-        <w:t>Every candidate (rule-based or LLM-generated) shall pass differential testing on at least 25 input sets and, for straight-line code, symbolic polynomial equivalence checking, before being considered for acceptance.</w:t>
+        <w:t xml:space="preserve"> Every candidate (rule-based or LLM-generated) shall pass differential testing on at least 25 input sets and, for straight-line code, symbolic polynomial equivalence checking, before being considered for acceptance.</w:t>
       </w:r>
     </w:p>
     <w:p>
@@ -7106,7 +7104,10 @@
         <w:t>Cost-based acceptance:</w:t>
       </w:r>
       <w:r>
-        <w:t xml:space="preserve"> A candidate shall be accepted only if its weighted static cost is strictly lower than the current program’s cost.</w:t>
+        <w:t xml:space="preserve"> </w:t>
+      </w:r>
+      <w:r>
+        <w:t>A candidate shall be accepted only if its weighted static cost is strictly lower than the current program’s cost.</w:t>
       </w:r>
     </w:p>
     <w:p>
@@ -7194,7 +7195,7 @@
         <w:spacing w:before="240" w:after="120" w:line="360" w:lineRule="auto"/>
       </w:pPr>
       <w:bookmarkStart w:id="37" w:name="_298309ba8f1e0e1ddd791a38a75cbc39715fedb"/>
-      <w:bookmarkStart w:id="38" w:name="_Toc242792997"/>
+      <w:bookmarkStart w:id="38" w:name="_Toc242796313"/>
       <w:r>
         <w:rPr>
           <w:rStyle w:val="SectionNumber"/>
@@ -7364,7 +7365,7 @@
         <w:spacing w:before="240" w:after="120" w:line="360" w:lineRule="auto"/>
       </w:pPr>
       <w:bookmarkStart w:id="39" w:name="_4ee663bad93a0e66274e7b93e4c59553636251f"/>
-      <w:bookmarkStart w:id="40" w:name="_Toc242792998"/>
+      <w:bookmarkStart w:id="40" w:name="_Toc242796314"/>
       <w:r>
         <w:rPr>
           <w:rStyle w:val="SectionNumber"/>
@@ -7387,7 +7388,7 @@
         <w:spacing w:before="240" w:after="120" w:line="360" w:lineRule="auto"/>
       </w:pPr>
       <w:bookmarkStart w:id="41" w:name="_3d43c2403cfc1f592a4c682c533aa090df2456d"/>
-      <w:bookmarkStart w:id="42" w:name="_Toc242792999"/>
+      <w:bookmarkStart w:id="42" w:name="_Toc242796315"/>
       <w:r>
         <w:rPr>
           <w:rStyle w:val="SectionNumber"/>
@@ -7652,7 +7653,7 @@
         <w:spacing w:before="240" w:after="120" w:line="360" w:lineRule="auto"/>
       </w:pPr>
       <w:bookmarkStart w:id="44" w:name="_43cd90e514deb2d54fa9fca7e7bae9b47cfc17d"/>
-      <w:bookmarkStart w:id="45" w:name="_Toc242793000"/>
+      <w:bookmarkStart w:id="45" w:name="_Toc242796316"/>
       <w:bookmarkEnd w:id="43"/>
       <w:r>
         <w:rPr>
@@ -8452,7 +8453,7 @@
         <w:jc w:val="center"/>
       </w:pPr>
       <w:bookmarkStart w:id="47" w:name="_4ca3701f03497b693eff5462480c47bf3ef0a20"/>
-      <w:bookmarkStart w:id="48" w:name="_Toc242793001"/>
+      <w:bookmarkStart w:id="48" w:name="_Toc242796317"/>
       <w:r>
         <w:rPr>
           <w:rStyle w:val="SectionNumber"/>
@@ -8478,7 +8479,7 @@
         <w:spacing w:before="240" w:after="120" w:line="360" w:lineRule="auto"/>
       </w:pPr>
       <w:bookmarkStart w:id="49" w:name="_datasets"/>
-      <w:bookmarkStart w:id="50" w:name="_Toc242793002"/>
+      <w:bookmarkStart w:id="50" w:name="_Toc242796318"/>
       <w:r>
         <w:rPr>
           <w:rStyle w:val="SectionNumber"/>
@@ -9134,7 +9135,7 @@
         <w:spacing w:before="240" w:after="120" w:line="360" w:lineRule="auto"/>
       </w:pPr>
       <w:bookmarkStart w:id="52" w:name="_3cdf90b4fb322d64ad15dc6470dae55edabed50"/>
-      <w:bookmarkStart w:id="53" w:name="_Toc242793003"/>
+      <w:bookmarkStart w:id="53" w:name="_Toc242796319"/>
       <w:r>
         <w:rPr>
           <w:rStyle w:val="SectionNumber"/>
@@ -9203,7 +9204,7 @@
         </w:rPr>
         <w:lastRenderedPageBreak/>
         <w:drawing>
-          <wp:inline distT="0" distB="0" distL="0" distR="0" wp14:anchorId="195EABBD" wp14:editId="5FEF3039">
+          <wp:inline distT="0" distB="0" distL="0" distR="0" wp14:anchorId="4DD83101" wp14:editId="79DCC7E1">
             <wp:extent cx="5276088" cy="2436387"/>
             <wp:effectExtent l="0" t="0" r="0" b="0"/>
             <wp:docPr id="42" name="Picture"/>
@@ -9403,7 +9404,7 @@
         <w:spacing w:before="240" w:after="120" w:line="360" w:lineRule="auto"/>
       </w:pPr>
       <w:bookmarkStart w:id="55" w:name="_1d1d4d0190f17892863f39dfecf2e339b550aa4"/>
-      <w:bookmarkStart w:id="56" w:name="_Toc242793004"/>
+      <w:bookmarkStart w:id="56" w:name="_Toc242796320"/>
       <w:r>
         <w:rPr>
           <w:rStyle w:val="SectionNumber"/>
@@ -9524,6 +9525,7 @@
                 <w:b/>
                 <w:bCs/>
                 <w:sz w:val="22"/>
+                <w:highlight w:val="yellow"/>
               </w:rPr>
               <w:t>Mode</w:t>
             </w:r>
@@ -9755,7 +9757,7 @@
         <w:spacing w:before="240" w:after="120" w:line="360" w:lineRule="auto"/>
       </w:pPr>
       <w:bookmarkStart w:id="58" w:name="_e1aec69a45ac9fc8784b7bff53fa2d228a2ee84"/>
-      <w:bookmarkStart w:id="59" w:name="_Toc242793005"/>
+      <w:bookmarkStart w:id="59" w:name="_Toc242796321"/>
       <w:bookmarkEnd w:id="57"/>
       <w:r>
         <w:rPr>
@@ -10164,7 +10166,7 @@
         <w:spacing w:before="240" w:after="120" w:line="360" w:lineRule="auto"/>
       </w:pPr>
       <w:bookmarkStart w:id="61" w:name="_algorithms"/>
-      <w:bookmarkStart w:id="62" w:name="_Toc242793006"/>
+      <w:bookmarkStart w:id="62" w:name="_Toc242796322"/>
       <w:bookmarkEnd w:id="60"/>
       <w:r>
         <w:rPr>
@@ -10198,7 +10200,7 @@
         <w:spacing w:before="240" w:after="120" w:line="360" w:lineRule="auto"/>
       </w:pPr>
       <w:bookmarkStart w:id="63" w:name="_6af77164fde844cafdf32818775e4df6b6c69a4"/>
-      <w:bookmarkStart w:id="64" w:name="_Toc242793007"/>
+      <w:bookmarkStart w:id="64" w:name="_Toc242796323"/>
       <w:r>
         <w:rPr>
           <w:rStyle w:val="SectionNumber"/>
@@ -10231,7 +10233,7 @@
         <w:spacing w:before="240" w:after="120" w:line="360" w:lineRule="auto"/>
       </w:pPr>
       <w:bookmarkStart w:id="65" w:name="_56833c7489700ced9d79371fbc295a7297e9921"/>
-      <w:bookmarkStart w:id="66" w:name="_Toc242793008"/>
+      <w:bookmarkStart w:id="66" w:name="_Toc242796324"/>
       <w:r>
         <w:rPr>
           <w:rStyle w:val="SectionNumber"/>
@@ -10401,7 +10403,7 @@
         <w:spacing w:before="240" w:after="120" w:line="360" w:lineRule="auto"/>
       </w:pPr>
       <w:bookmarkStart w:id="67" w:name="_03befe573c977c38a093f8589f9656bbdc056af"/>
-      <w:bookmarkStart w:id="68" w:name="_Toc242793009"/>
+      <w:bookmarkStart w:id="68" w:name="_Toc242796325"/>
       <w:r>
         <w:rPr>
           <w:rStyle w:val="SectionNumber"/>
@@ -10497,7 +10499,7 @@
         <w:spacing w:before="240" w:after="120" w:line="360" w:lineRule="auto"/>
       </w:pPr>
       <w:bookmarkStart w:id="69" w:name="_a23d513016f6abea4968068d2e64f2cb19c389d"/>
-      <w:bookmarkStart w:id="70" w:name="_Toc242793010"/>
+      <w:bookmarkStart w:id="70" w:name="_Toc242796326"/>
       <w:r>
         <w:rPr>
           <w:rStyle w:val="SectionNumber"/>
@@ -11217,7 +11219,7 @@
         <w:spacing w:before="240" w:after="120" w:line="360" w:lineRule="auto"/>
       </w:pPr>
       <w:bookmarkStart w:id="72" w:name="_design"/>
-      <w:bookmarkStart w:id="73" w:name="_Toc242793011"/>
+      <w:bookmarkStart w:id="73" w:name="_Toc242796327"/>
       <w:r>
         <w:rPr>
           <w:rStyle w:val="SectionNumber"/>
@@ -11240,7 +11242,7 @@
         <w:spacing w:before="240" w:after="120" w:line="360" w:lineRule="auto"/>
       </w:pPr>
       <w:bookmarkStart w:id="74" w:name="_7ecdd9a60c07600be8280989fed5d4b9826000a"/>
-      <w:bookmarkStart w:id="75" w:name="_Toc242793012"/>
+      <w:bookmarkStart w:id="75" w:name="_Toc242796328"/>
       <w:r>
         <w:rPr>
           <w:rStyle w:val="SectionNumber"/>
@@ -11264,7 +11266,7 @@
           <w:noProof/>
         </w:rPr>
         <w:drawing>
-          <wp:inline distT="0" distB="0" distL="0" distR="0" wp14:anchorId="7619EE3E" wp14:editId="5BD5C42C">
+          <wp:inline distT="0" distB="0" distL="0" distR="0" wp14:anchorId="25ECFEBF" wp14:editId="0FF5B08B">
             <wp:extent cx="5276088" cy="2813913"/>
             <wp:effectExtent l="0" t="0" r="0" b="0"/>
             <wp:docPr id="58" name="Picture"/>
@@ -11322,7 +11324,7 @@
         <w:spacing w:before="240" w:after="120" w:line="360" w:lineRule="auto"/>
       </w:pPr>
       <w:bookmarkStart w:id="77" w:name="_3b18b8106ac8f3f5e98151fc02ea3b0b92d96f3"/>
-      <w:bookmarkStart w:id="78" w:name="_Toc242793013"/>
+      <w:bookmarkStart w:id="78" w:name="_Toc242796329"/>
       <w:bookmarkEnd w:id="76"/>
       <w:r>
         <w:rPr>
@@ -11348,7 +11350,7 @@
           <w:noProof/>
         </w:rPr>
         <w:drawing>
-          <wp:inline distT="0" distB="0" distL="0" distR="0" wp14:anchorId="32D3AB5F" wp14:editId="7D6217C0">
+          <wp:inline distT="0" distB="0" distL="0" distR="0" wp14:anchorId="5F827F17" wp14:editId="2C5270D8">
             <wp:extent cx="5276088" cy="2805733"/>
             <wp:effectExtent l="0" t="0" r="0" b="0"/>
             <wp:docPr id="63" name="Picture"/>
@@ -11426,7 +11428,7 @@
         <w:jc w:val="center"/>
       </w:pPr>
       <w:bookmarkStart w:id="80" w:name="_implementation"/>
-      <w:bookmarkStart w:id="81" w:name="_Toc242793014"/>
+      <w:bookmarkStart w:id="81" w:name="_Toc242796330"/>
       <w:r>
         <w:rPr>
           <w:rStyle w:val="SectionNumber"/>
@@ -11462,7 +11464,7 @@
         <w:spacing w:before="240" w:after="120" w:line="360" w:lineRule="auto"/>
       </w:pPr>
       <w:bookmarkStart w:id="82" w:name="_fe8ea128c32a30f6f62aad13fa2cbd68b4ed37a"/>
-      <w:bookmarkStart w:id="83" w:name="_Toc242793015"/>
+      <w:bookmarkStart w:id="83" w:name="_Toc242796331"/>
       <w:r>
         <w:rPr>
           <w:rStyle w:val="SectionNumber"/>
@@ -11487,7 +11489,7 @@
         <w:spacing w:before="240" w:after="120" w:line="360" w:lineRule="auto"/>
       </w:pPr>
       <w:bookmarkStart w:id="84" w:name="_43836c4362d26cc984c34341f67e1fd066109e8"/>
-      <w:bookmarkStart w:id="85" w:name="_Toc242793016"/>
+      <w:bookmarkStart w:id="85" w:name="_Toc242796332"/>
       <w:r>
         <w:rPr>
           <w:rStyle w:val="SectionNumber"/>
@@ -12160,7 +12162,7 @@
         <w:spacing w:before="240" w:after="120" w:line="360" w:lineRule="auto"/>
       </w:pPr>
       <w:bookmarkStart w:id="87" w:name="_79a2a4a88e9c159ebd0d8fee6aad452611188ed"/>
-      <w:bookmarkStart w:id="88" w:name="_Toc242793017"/>
+      <w:bookmarkStart w:id="88" w:name="_Toc242796333"/>
       <w:bookmarkEnd w:id="86"/>
       <w:r>
         <w:rPr>
@@ -12335,7 +12337,7 @@
         <w:spacing w:before="240" w:after="120" w:line="360" w:lineRule="auto"/>
       </w:pPr>
       <w:bookmarkStart w:id="89" w:name="_cfac646bea668bc8fcd96a99f22fb19c05f79be"/>
-      <w:bookmarkStart w:id="90" w:name="_Toc242793018"/>
+      <w:bookmarkStart w:id="90" w:name="_Toc242796334"/>
       <w:r>
         <w:rPr>
           <w:rStyle w:val="SectionNumber"/>
@@ -13612,7 +13614,16 @@
         <w:rPr>
           <w:highlight w:val="yellow"/>
         </w:rPr>
-        <w:t>, 386 lines) runs differential testing first. If the program has no control flow, it also runs the symbolic trace and requires both to agree. The cost evaluator (</w:t>
+        <w:t>, 386 lines) runs differential testing first.</w:t>
+      </w:r>
+      <w:r>
+        <w:t xml:space="preserve"> If the program has no control flow, it also runs the symbolic trace and requires both to agree. </w:t>
+      </w:r>
+      <w:r>
+        <w:rPr>
+          <w:highlight w:val="yellow"/>
+        </w:rPr>
+        <w:t>The cost evaluator (</w:t>
       </w:r>
       <w:r>
         <w:rPr>
@@ -13635,7 +13646,7 @@
         <w:spacing w:before="240" w:after="120" w:line="360" w:lineRule="auto"/>
       </w:pPr>
       <w:bookmarkStart w:id="92" w:name="_59509eeaefd8b88011f2c0b44dcef0761438708"/>
-      <w:bookmarkStart w:id="93" w:name="_Toc242793019"/>
+      <w:bookmarkStart w:id="93" w:name="_Toc242796335"/>
       <w:r>
         <w:rPr>
           <w:rStyle w:val="SectionNumber"/>
@@ -14862,7 +14873,7 @@
         <w:spacing w:before="240" w:after="120" w:line="360" w:lineRule="auto"/>
       </w:pPr>
       <w:bookmarkStart w:id="95" w:name="_0f736833c94e1e213be9bf19376c28aee237517"/>
-      <w:bookmarkStart w:id="96" w:name="_Toc242793020"/>
+      <w:bookmarkStart w:id="96" w:name="_Toc242796336"/>
       <w:bookmarkEnd w:id="94"/>
       <w:r>
         <w:rPr>
@@ -15013,7 +15024,7 @@
         <w:spacing w:before="240" w:after="120" w:line="360" w:lineRule="auto"/>
       </w:pPr>
       <w:bookmarkStart w:id="97" w:name="_b94b9999f8e2119e71aa9fc43cc189be41c66a2"/>
-      <w:bookmarkStart w:id="98" w:name="_Toc242793021"/>
+      <w:bookmarkStart w:id="98" w:name="_Toc242796337"/>
       <w:r>
         <w:rPr>
           <w:rStyle w:val="SectionNumber"/>
@@ -15099,7 +15110,7 @@
         <w:spacing w:before="240" w:after="120" w:line="360" w:lineRule="auto"/>
       </w:pPr>
       <w:bookmarkStart w:id="99" w:name="_2b1064282f8c7610b8e366cbfe8dc85e9179828"/>
-      <w:bookmarkStart w:id="100" w:name="_Toc242793022"/>
+      <w:bookmarkStart w:id="100" w:name="_Toc242796338"/>
       <w:r>
         <w:rPr>
           <w:rStyle w:val="SectionNumber"/>
@@ -15455,6 +15466,7 @@
             <w:r>
               <w:rPr>
                 <w:sz w:val="22"/>
+                <w:highlight w:val="yellow"/>
               </w:rPr>
               <w:t>C front end</w:t>
             </w:r>
@@ -15893,6 +15905,7 @@
             <w:r>
               <w:rPr>
                 <w:sz w:val="22"/>
+                <w:highlight w:val="yellow"/>
               </w:rPr>
               <w:t>40</w:t>
             </w:r>
@@ -16154,7 +16167,16 @@
         <w:rPr>
           <w:highlight w:val="yellow"/>
         </w:rPr>
-        <w:t>We inject incorrect transformations (wrong constant folds, operand swaps on non-commutative operators, deletion of live stores, off-by-one loop conditions, removed loop increments, deleted trapping divisions, reordered output, and dropped output) and confirm that every one is rejected. This is how we verify the verifier itself. We then tested the system at a larger scale:</w:t>
+        <w:t>We inject incorrect transformations (wrong constant folds, operand swaps on non-commutative operators, deletion of live stores, off-by-one loop conditions, removed loop increments, deleted trapping divisions, reordered output, and dropped output) and confirm that every one is rejected.</w:t>
+      </w:r>
+      <w:r>
+        <w:t xml:space="preserve"> This is how we verify the verifier itself. </w:t>
+      </w:r>
+      <w:r>
+        <w:rPr>
+          <w:highlight w:val="yellow"/>
+        </w:rPr>
+        <w:t>We then tested the system at a larger scale:</w:t>
       </w:r>
     </w:p>
     <w:p>
@@ -16391,7 +16413,7 @@
         <w:jc w:val="center"/>
       </w:pPr>
       <w:bookmarkStart w:id="102" w:name="_ca0a51c6bd51be63cd201e7aafb2a2c80ddc4b2"/>
-      <w:bookmarkStart w:id="103" w:name="_Toc242793023"/>
+      <w:bookmarkStart w:id="103" w:name="_Toc242796339"/>
       <w:r>
         <w:rPr>
           <w:rStyle w:val="SectionNumber"/>
@@ -16417,7 +16439,7 @@
         <w:spacing w:before="240" w:after="120" w:line="360" w:lineRule="auto"/>
       </w:pPr>
       <w:bookmarkStart w:id="104" w:name="_7191f83fb773762ca3a6f85173667b3c76830f8"/>
-      <w:bookmarkStart w:id="105" w:name="_Toc242793024"/>
+      <w:bookmarkStart w:id="105" w:name="_Toc242796340"/>
       <w:r>
         <w:rPr>
           <w:rStyle w:val="SectionNumber"/>
@@ -17132,6 +17154,7 @@
             <w:r>
               <w:rPr>
                 <w:sz w:val="22"/>
+                <w:highlight w:val="yellow"/>
               </w:rPr>
               <w:t>22.2</w:t>
             </w:r>
@@ -17150,6 +17173,7 @@
             <w:r>
               <w:rPr>
                 <w:sz w:val="22"/>
+                <w:highlight w:val="yellow"/>
               </w:rPr>
               <w:t>22.7</w:t>
             </w:r>
@@ -17168,6 +17192,7 @@
             <w:r>
               <w:rPr>
                 <w:sz w:val="22"/>
+                <w:highlight w:val="yellow"/>
               </w:rPr>
               <w:t>22.9</w:t>
             </w:r>
@@ -18540,7 +18565,7 @@
         <w:spacing w:before="240" w:after="120" w:line="360" w:lineRule="auto"/>
       </w:pPr>
       <w:bookmarkStart w:id="108" w:name="_65477720e1496782b5da4af4c286d530c468be6"/>
-      <w:bookmarkStart w:id="109" w:name="_Toc242793025"/>
+      <w:bookmarkStart w:id="109" w:name="_Toc242796341"/>
       <w:r>
         <w:rPr>
           <w:rStyle w:val="SectionNumber"/>
@@ -18835,6 +18860,7 @@
             <w:r>
               <w:rPr>
                 <w:sz w:val="22"/>
+                <w:highlight w:val="yellow"/>
               </w:rPr>
               <w:t>181</w:t>
             </w:r>
@@ -19011,6 +19037,7 @@
             <w:r>
               <w:rPr>
                 <w:sz w:val="22"/>
+                <w:highlight w:val="yellow"/>
               </w:rPr>
               <w:t>198</w:t>
             </w:r>
@@ -19130,6 +19157,7 @@
             <w:r>
               <w:rPr>
                 <w:sz w:val="22"/>
+                <w:highlight w:val="yellow"/>
               </w:rPr>
               <w:t>52</w:t>
             </w:r>
@@ -19364,6 +19392,7 @@
             <w:r>
               <w:rPr>
                 <w:sz w:val="22"/>
+                <w:highlight w:val="yellow"/>
               </w:rPr>
               <w:t>43 min</w:t>
             </w:r>
@@ -19463,7 +19492,7 @@
         <w:spacing w:before="240" w:after="120" w:line="360" w:lineRule="auto"/>
       </w:pPr>
       <w:bookmarkStart w:id="111" w:name="_a15deaafbca46b68f4c94dbd24724fd2739a480"/>
-      <w:bookmarkStart w:id="112" w:name="_Toc242793026"/>
+      <w:bookmarkStart w:id="112" w:name="_Toc242796342"/>
       <w:r>
         <w:rPr>
           <w:rStyle w:val="SectionNumber"/>
@@ -19486,7 +19515,7 @@
         <w:spacing w:before="240" w:after="120" w:line="360" w:lineRule="auto"/>
       </w:pPr>
       <w:bookmarkStart w:id="113" w:name="_b90c127e1d5e77a397df9c91989216ee033fd9f"/>
-      <w:bookmarkStart w:id="114" w:name="_Toc242793027"/>
+      <w:bookmarkStart w:id="114" w:name="_Toc242796343"/>
       <w:r>
         <w:rPr>
           <w:rStyle w:val="SectionNumber"/>
@@ -20019,7 +20048,7 @@
         <w:spacing w:before="240" w:after="120" w:line="360" w:lineRule="auto"/>
       </w:pPr>
       <w:bookmarkStart w:id="116" w:name="_fc9a26f982cb3e2870b96648b08307cefd987b3"/>
-      <w:bookmarkStart w:id="117" w:name="_Toc242793028"/>
+      <w:bookmarkStart w:id="117" w:name="_Toc242796344"/>
       <w:r>
         <w:rPr>
           <w:rStyle w:val="SectionNumber"/>
@@ -20044,7 +20073,7 @@
           <w:noProof/>
         </w:rPr>
         <w:drawing>
-          <wp:inline distT="0" distB="0" distL="0" distR="0" wp14:anchorId="37362274" wp14:editId="32D47FCD">
+          <wp:inline distT="0" distB="0" distL="0" distR="0" wp14:anchorId="71BFDFFD" wp14:editId="6900DEB9">
             <wp:extent cx="5276088" cy="2723867"/>
             <wp:effectExtent l="0" t="0" r="0" b="0"/>
             <wp:docPr id="90" name="Picture"/>
@@ -20102,7 +20131,7 @@
         <w:spacing w:before="240" w:after="120" w:line="360" w:lineRule="auto"/>
       </w:pPr>
       <w:bookmarkStart w:id="119" w:name="_07a743cb0410fd3a53b6d3a518b3f8bf9a58be6"/>
-      <w:bookmarkStart w:id="120" w:name="_Toc242793029"/>
+      <w:bookmarkStart w:id="120" w:name="_Toc242796345"/>
       <w:bookmarkEnd w:id="118"/>
       <w:r>
         <w:rPr>
@@ -20127,7 +20156,7 @@
           <w:noProof/>
         </w:rPr>
         <w:drawing>
-          <wp:inline distT="0" distB="0" distL="0" distR="0" wp14:anchorId="1D37B623" wp14:editId="7D532E4F">
+          <wp:inline distT="0" distB="0" distL="0" distR="0" wp14:anchorId="616D5C1C" wp14:editId="3B739682">
             <wp:extent cx="5276088" cy="2913941"/>
             <wp:effectExtent l="0" t="0" r="0" b="0"/>
             <wp:docPr id="95" name="Picture"/>
@@ -20185,7 +20214,7 @@
         <w:spacing w:before="240" w:after="120" w:line="360" w:lineRule="auto"/>
       </w:pPr>
       <w:bookmarkStart w:id="122" w:name="_2e1816ab1c2b1e78ffd5800c988097f1d6b890e"/>
-      <w:bookmarkStart w:id="123" w:name="_Toc242793030"/>
+      <w:bookmarkStart w:id="123" w:name="_Toc242796346"/>
       <w:bookmarkEnd w:id="121"/>
       <w:r>
         <w:rPr>
@@ -20211,7 +20240,7 @@
           <w:noProof/>
         </w:rPr>
         <w:drawing>
-          <wp:inline distT="0" distB="0" distL="0" distR="0" wp14:anchorId="7B24857B" wp14:editId="4321B865">
+          <wp:inline distT="0" distB="0" distL="0" distR="0" wp14:anchorId="5C61C820" wp14:editId="2E4757BB">
             <wp:extent cx="5276088" cy="3032321"/>
             <wp:effectExtent l="0" t="0" r="0" b="0"/>
             <wp:docPr id="100" name="Picture"/>
@@ -20269,7 +20298,7 @@
         <w:spacing w:before="240" w:after="120" w:line="360" w:lineRule="auto"/>
       </w:pPr>
       <w:bookmarkStart w:id="125" w:name="_48a459cc283b22da02374b8da4b600b292fa8f8"/>
-      <w:bookmarkStart w:id="126" w:name="_Toc242793031"/>
+      <w:bookmarkStart w:id="126" w:name="_Toc242796347"/>
       <w:bookmarkEnd w:id="124"/>
       <w:r>
         <w:rPr>
@@ -20294,7 +20323,7 @@
           <w:noProof/>
         </w:rPr>
         <w:drawing>
-          <wp:inline distT="0" distB="0" distL="0" distR="0" wp14:anchorId="7FABC624" wp14:editId="7BDD4FE8">
+          <wp:inline distT="0" distB="0" distL="0" distR="0" wp14:anchorId="01FD6E30" wp14:editId="7278E553">
             <wp:extent cx="4800600" cy="3260390"/>
             <wp:effectExtent l="0" t="0" r="0" b="0"/>
             <wp:docPr id="105" name="Picture"/>
@@ -20352,7 +20381,7 @@
         <w:spacing w:before="240" w:after="120" w:line="360" w:lineRule="auto"/>
       </w:pPr>
       <w:bookmarkStart w:id="128" w:name="_40055a447bd930964b6f153e9c3d9ed892ff159"/>
-      <w:bookmarkStart w:id="129" w:name="_Toc242793032"/>
+      <w:bookmarkStart w:id="129" w:name="_Toc242796348"/>
       <w:bookmarkEnd w:id="127"/>
       <w:r>
         <w:rPr>
@@ -20378,7 +20407,7 @@
           <w:noProof/>
         </w:rPr>
         <w:drawing>
-          <wp:inline distT="0" distB="0" distL="0" distR="0" wp14:anchorId="744F68CB" wp14:editId="25743B25">
+          <wp:inline distT="0" distB="0" distL="0" distR="0" wp14:anchorId="2302A2B5" wp14:editId="3728C668">
             <wp:extent cx="5276088" cy="2587289"/>
             <wp:effectExtent l="0" t="0" r="0" b="0"/>
             <wp:docPr id="110" name="Picture"/>
@@ -20436,7 +20465,7 @@
         <w:spacing w:before="240" w:after="120" w:line="360" w:lineRule="auto"/>
       </w:pPr>
       <w:bookmarkStart w:id="131" w:name="_9727f4afa2921e206e2c2f7b89415af37a44c31"/>
-      <w:bookmarkStart w:id="132" w:name="_Toc242793033"/>
+      <w:bookmarkStart w:id="132" w:name="_Toc242796349"/>
       <w:bookmarkEnd w:id="130"/>
       <w:r>
         <w:rPr>
@@ -20461,7 +20490,7 @@
           <w:noProof/>
         </w:rPr>
         <w:drawing>
-          <wp:inline distT="0" distB="0" distL="0" distR="0" wp14:anchorId="770DB69B" wp14:editId="6423530A">
+          <wp:inline distT="0" distB="0" distL="0" distR="0" wp14:anchorId="325056A7" wp14:editId="4F191A76">
             <wp:extent cx="5276088" cy="3075205"/>
             <wp:effectExtent l="0" t="0" r="0" b="0"/>
             <wp:docPr id="115" name="Picture"/>
@@ -20519,7 +20548,7 @@
         <w:spacing w:before="240" w:after="120" w:line="360" w:lineRule="auto"/>
       </w:pPr>
       <w:bookmarkStart w:id="134" w:name="_cdd493b9faf3f0ad3fc6aa5bed861db4f0085b5"/>
-      <w:bookmarkStart w:id="135" w:name="_Toc242793034"/>
+      <w:bookmarkStart w:id="135" w:name="_Toc242796350"/>
       <w:bookmarkEnd w:id="133"/>
       <w:r>
         <w:rPr>
@@ -20549,7 +20578,7 @@
           <w:noProof/>
         </w:rPr>
         <w:drawing>
-          <wp:inline distT="0" distB="0" distL="0" distR="0" wp14:anchorId="3A3594DA" wp14:editId="349C5074">
+          <wp:inline distT="0" distB="0" distL="0" distR="0" wp14:anchorId="1118F9E3" wp14:editId="063724DA">
             <wp:extent cx="4800600" cy="2984344"/>
             <wp:effectExtent l="0" t="0" r="0" b="0"/>
             <wp:docPr id="120" name="Picture"/>
@@ -20616,7 +20645,7 @@
           <w:noProof/>
         </w:rPr>
         <w:drawing>
-          <wp:inline distT="0" distB="0" distL="0" distR="0" wp14:anchorId="6BC74323" wp14:editId="56677D1D">
+          <wp:inline distT="0" distB="0" distL="0" distR="0" wp14:anchorId="0C8D7931" wp14:editId="2A6F16E8">
             <wp:extent cx="4800600" cy="2978727"/>
             <wp:effectExtent l="0" t="0" r="0" b="0"/>
             <wp:docPr id="124" name="Picture"/>
@@ -20684,7 +20713,7 @@
         </w:rPr>
         <w:lastRenderedPageBreak/>
         <w:drawing>
-          <wp:inline distT="0" distB="0" distL="0" distR="0" wp14:anchorId="5B37B4D9" wp14:editId="0321D795">
+          <wp:inline distT="0" distB="0" distL="0" distR="0" wp14:anchorId="02CE8E6A" wp14:editId="493A1A9A">
             <wp:extent cx="4800600" cy="2978727"/>
             <wp:effectExtent l="0" t="0" r="0" b="0"/>
             <wp:docPr id="128" name="Picture"/>
@@ -20745,7 +20774,7 @@
         <w:spacing w:before="240" w:after="120" w:line="360" w:lineRule="auto"/>
       </w:pPr>
       <w:bookmarkStart w:id="139" w:name="_01152238eaa4decca22addad0ccbc36abd05e18"/>
-      <w:bookmarkStart w:id="140" w:name="_Toc242793035"/>
+      <w:bookmarkStart w:id="140" w:name="_Toc242796351"/>
       <w:bookmarkEnd w:id="138"/>
       <w:r>
         <w:rPr>
@@ -20817,7 +20846,7 @@
           <w:noProof/>
         </w:rPr>
         <w:drawing>
-          <wp:inline distT="0" distB="0" distL="0" distR="0" wp14:anchorId="44580E13" wp14:editId="0120C96C">
+          <wp:inline distT="0" distB="0" distL="0" distR="0" wp14:anchorId="551B5239" wp14:editId="142E421B">
             <wp:extent cx="5276088" cy="2723867"/>
             <wp:effectExtent l="0" t="0" r="0" b="0"/>
             <wp:docPr id="133" name="Picture"/>
@@ -20885,7 +20914,7 @@
         </w:rPr>
         <w:lastRenderedPageBreak/>
         <w:drawing>
-          <wp:inline distT="0" distB="0" distL="0" distR="0" wp14:anchorId="61DBE888" wp14:editId="4C74A15E">
+          <wp:inline distT="0" distB="0" distL="0" distR="0" wp14:anchorId="4DAAC0C7" wp14:editId="2AB26A43">
             <wp:extent cx="5276088" cy="2904302"/>
             <wp:effectExtent l="0" t="0" r="0" b="0"/>
             <wp:docPr id="137" name="Picture"/>
@@ -20952,7 +20981,7 @@
           <w:noProof/>
         </w:rPr>
         <w:drawing>
-          <wp:inline distT="0" distB="0" distL="0" distR="0" wp14:anchorId="315F7109" wp14:editId="35803099">
+          <wp:inline distT="0" distB="0" distL="0" distR="0" wp14:anchorId="19A34942" wp14:editId="283E364E">
             <wp:extent cx="5276088" cy="3033940"/>
             <wp:effectExtent l="0" t="0" r="0" b="0"/>
             <wp:docPr id="141" name="Picture"/>
@@ -21020,7 +21049,7 @@
         </w:rPr>
         <w:lastRenderedPageBreak/>
         <w:drawing>
-          <wp:inline distT="0" distB="0" distL="0" distR="0" wp14:anchorId="11D53E9E" wp14:editId="3CCFEF7E">
+          <wp:inline distT="0" distB="0" distL="0" distR="0" wp14:anchorId="75B61331" wp14:editId="650B3C3B">
             <wp:extent cx="4800600" cy="3253368"/>
             <wp:effectExtent l="0" t="0" r="0" b="0"/>
             <wp:docPr id="145" name="Picture"/>
@@ -21087,7 +21116,7 @@
           <w:noProof/>
         </w:rPr>
         <w:drawing>
-          <wp:inline distT="0" distB="0" distL="0" distR="0" wp14:anchorId="1023822D" wp14:editId="3D45C42D">
+          <wp:inline distT="0" distB="0" distL="0" distR="0" wp14:anchorId="7B127FF7" wp14:editId="0FC43373">
             <wp:extent cx="5276088" cy="2590851"/>
             <wp:effectExtent l="0" t="0" r="0" b="0"/>
             <wp:docPr id="149" name="Picture"/>
@@ -21155,7 +21184,7 @@
         </w:rPr>
         <w:lastRenderedPageBreak/>
         <w:drawing>
-          <wp:inline distT="0" distB="0" distL="0" distR="0" wp14:anchorId="3883C54B" wp14:editId="3234AB02">
+          <wp:inline distT="0" distB="0" distL="0" distR="0" wp14:anchorId="74F67B0C" wp14:editId="2EDB6502">
             <wp:extent cx="5276088" cy="3065478"/>
             <wp:effectExtent l="0" t="0" r="0" b="0"/>
             <wp:docPr id="153" name="Picture"/>
@@ -21216,7 +21245,7 @@
         <w:spacing w:before="240" w:after="120" w:line="360" w:lineRule="auto"/>
       </w:pPr>
       <w:bookmarkStart w:id="147" w:name="_abebb12106dd42a73400e5c50afab472b365173"/>
-      <w:bookmarkStart w:id="148" w:name="_Toc242793036"/>
+      <w:bookmarkStart w:id="148" w:name="_Toc242796352"/>
       <w:bookmarkEnd w:id="146"/>
       <w:r>
         <w:rPr>
@@ -21294,7 +21323,7 @@
           <w:noProof/>
         </w:rPr>
         <w:drawing>
-          <wp:inline distT="0" distB="0" distL="0" distR="0" wp14:anchorId="2991409F" wp14:editId="4468E5E2">
+          <wp:inline distT="0" distB="0" distL="0" distR="0" wp14:anchorId="31BEDC10" wp14:editId="020D1F98">
             <wp:extent cx="5276088" cy="2723867"/>
             <wp:effectExtent l="0" t="0" r="0" b="0"/>
             <wp:docPr id="158" name="Picture"/>
@@ -21362,7 +21391,7 @@
         </w:rPr>
         <w:lastRenderedPageBreak/>
         <w:drawing>
-          <wp:inline distT="0" distB="0" distL="0" distR="0" wp14:anchorId="0747EBF1" wp14:editId="6D33320C">
+          <wp:inline distT="0" distB="0" distL="0" distR="0" wp14:anchorId="4C81AC29" wp14:editId="25B6859A">
             <wp:extent cx="5276088" cy="2904302"/>
             <wp:effectExtent l="0" t="0" r="0" b="0"/>
             <wp:docPr id="162" name="Picture"/>
@@ -21429,7 +21458,7 @@
           <w:noProof/>
         </w:rPr>
         <w:drawing>
-          <wp:inline distT="0" distB="0" distL="0" distR="0" wp14:anchorId="6013EAB9" wp14:editId="7720987D">
+          <wp:inline distT="0" distB="0" distL="0" distR="0" wp14:anchorId="66303438" wp14:editId="625028ED">
             <wp:extent cx="5276088" cy="3033940"/>
             <wp:effectExtent l="0" t="0" r="0" b="0"/>
             <wp:docPr id="166" name="Picture"/>
@@ -21497,7 +21526,7 @@
         </w:rPr>
         <w:lastRenderedPageBreak/>
         <w:drawing>
-          <wp:inline distT="0" distB="0" distL="0" distR="0" wp14:anchorId="3886F915" wp14:editId="2D0E7645">
+          <wp:inline distT="0" distB="0" distL="0" distR="0" wp14:anchorId="383EEB1C" wp14:editId="60CE50EF">
             <wp:extent cx="4800600" cy="3253368"/>
             <wp:effectExtent l="0" t="0" r="0" b="0"/>
             <wp:docPr id="170" name="Picture"/>
@@ -21564,7 +21593,7 @@
           <w:noProof/>
         </w:rPr>
         <w:drawing>
-          <wp:inline distT="0" distB="0" distL="0" distR="0" wp14:anchorId="1EDBEE2A" wp14:editId="764C8477">
+          <wp:inline distT="0" distB="0" distL="0" distR="0" wp14:anchorId="6603D0C4" wp14:editId="3B6CD747">
             <wp:extent cx="5276088" cy="2590851"/>
             <wp:effectExtent l="0" t="0" r="0" b="0"/>
             <wp:docPr id="174" name="Picture"/>
@@ -21632,7 +21661,7 @@
         </w:rPr>
         <w:lastRenderedPageBreak/>
         <w:drawing>
-          <wp:inline distT="0" distB="0" distL="0" distR="0" wp14:anchorId="7082C6CF" wp14:editId="6411DD85">
+          <wp:inline distT="0" distB="0" distL="0" distR="0" wp14:anchorId="598BA418" wp14:editId="5D231CBC">
             <wp:extent cx="5276088" cy="3065478"/>
             <wp:effectExtent l="0" t="0" r="0" b="0"/>
             <wp:docPr id="178" name="Picture"/>
@@ -21693,7 +21722,7 @@
         <w:spacing w:before="240" w:after="120" w:line="360" w:lineRule="auto"/>
       </w:pPr>
       <w:bookmarkStart w:id="155" w:name="_1e541f574dc12daae501b4e4d93852104a4e612"/>
-      <w:bookmarkStart w:id="156" w:name="_Toc242793037"/>
+      <w:bookmarkStart w:id="156" w:name="_Toc242796353"/>
       <w:bookmarkEnd w:id="154"/>
       <w:r>
         <w:rPr>
@@ -21924,7 +21953,7 @@
         <w:spacing w:before="240" w:after="120" w:line="360" w:lineRule="auto"/>
       </w:pPr>
       <w:bookmarkStart w:id="157" w:name="_limitations"/>
-      <w:bookmarkStart w:id="158" w:name="_Toc242793038"/>
+      <w:bookmarkStart w:id="158" w:name="_Toc242796354"/>
       <w:r>
         <w:rPr>
           <w:rStyle w:val="SectionNumber"/>
@@ -22030,7 +22059,7 @@
         <w:spacing w:after="240"/>
         <w:jc w:val="center"/>
       </w:pPr>
-      <w:bookmarkStart w:id="159" w:name="_Toc242793039"/>
+      <w:bookmarkStart w:id="159" w:name="_Toc242796355"/>
       <w:r>
         <w:rPr>
           <w:bCs/>
@@ -22043,22 +22072,16 @@
     <w:p>
       <w:pPr>
         <w:pStyle w:val="FirstParagraph"/>
-        <w:spacing w:line="276" w:lineRule="auto"/>
-        <w:ind w:left="720" w:hanging="720"/>
-        <w:jc w:val="both"/>
-      </w:pPr>
-      <w:r>
-        <w:t xml:space="preserve">Aho, A. V., Lam, M. S., Sethi, R., &amp; Ullman, J. D. (2006). </w:t>
-      </w:r>
-      <w:r>
-        <w:rPr>
-          <w:i/>
-          <w:iCs/>
-        </w:rPr>
-        <w:t>Compilers: Principles, Techniques, and Tools</w:t>
-      </w:r>
-      <w:r>
-        <w:t xml:space="preserve"> (2nd ed.). Pearson.</w:t>
+        <w:keepNext/>
+        <w:spacing w:before="200" w:after="80" w:line="276" w:lineRule="auto"/>
+      </w:pPr>
+      <w:r>
+        <w:rPr>
+          <w:b/>
+          <w:bCs/>
+          <w:highlight w:val="yellow"/>
+        </w:rPr>
+        <w:t>Journals and Preprints:</w:t>
       </w:r>
     </w:p>
     <w:p>
@@ -22090,17 +22113,24 @@
         <w:jc w:val="both"/>
       </w:pPr>
       <w:r>
-        <w:t xml:space="preserve">Cummins, C., Wasti, B., Guo, J., Cui, B., Ansel, J., Gomez, S., … &amp; Leather, H. (2022). CompilerGym: Robust, performant compiler optimization environments for AI research. </w:t>
+        <w:rPr>
+          <w:highlight w:val="yellow"/>
+        </w:rPr>
+        <w:t xml:space="preserve">Cummins, C., Seeker, V., Grubisic, D., Roziere, B., Gehring, J., Synnaeve, G., &amp; Leather, H. (2024). Meta Large Language Model Compiler: Foundation models of compiler optimization. </w:t>
       </w:r>
       <w:r>
         <w:rPr>
           <w:i/>
           <w:iCs/>
-        </w:rPr>
-        <w:t>Proceedings of the IEEE/ACM International Symposium on Code Generation and Optimization (CGO)</w:t>
-      </w:r>
-      <w:r>
-        <w:t>, 92–105.</w:t>
+          <w:highlight w:val="yellow"/>
+        </w:rPr>
+        <w:t>arXiv preprint arXiv:2407.02524</w:t>
+      </w:r>
+      <w:r>
+        <w:rPr>
+          <w:highlight w:val="yellow"/>
+        </w:rPr>
+        <w:t>.</w:t>
       </w:r>
     </w:p>
     <w:p>
@@ -22111,23 +22141,16 @@
         <w:jc w:val="both"/>
       </w:pPr>
       <w:r>
-        <w:rPr>
-          <w:highlight w:val="yellow"/>
-        </w:rPr>
-        <w:t xml:space="preserve">Cummins, C., Seeker, V., Grubisic, D., Roziere, B., Gehring, J., Synnaeve, G., &amp; Leather, H. (2024). Meta Large Language Model Compiler: Foundation models of compiler optimization. </w:t>
+        <w:t xml:space="preserve">Rozière, B., Gehring, J., Gloeckle, F., Sootla, S., Gat, I., Tan, X. E., … &amp; Synnaeve, G. (2023). Code Llama: Open foundation models for code. </w:t>
       </w:r>
       <w:r>
         <w:rPr>
           <w:i/>
           <w:iCs/>
-          <w:highlight w:val="yellow"/>
-        </w:rPr>
-        <w:t>arXiv preprint arXiv:2407.02524</w:t>
-      </w:r>
-      <w:r>
-        <w:rPr>
-          <w:highlight w:val="yellow"/>
-        </w:rPr>
+        </w:rPr>
+        <w:t>arXiv preprint arXiv:2308.12950</w:t>
+      </w:r>
+      <w:r>
         <w:t>.</w:t>
       </w:r>
     </w:p>
@@ -22139,24 +22162,32 @@
         <w:jc w:val="both"/>
       </w:pPr>
       <w:r>
-        <w:rPr>
-          <w:highlight w:val="yellow"/>
-        </w:rPr>
-        <w:t xml:space="preserve">Groq. (2026). </w:t>
+        <w:t xml:space="preserve">Wu, Q., Bansal, G., Zhang, J., Wu, Y., Li, B., Zhu, E., … &amp; Wang, C. (2023). AutoGen: Enabling next-gen LLM applications via multi-agent conversation. </w:t>
       </w:r>
       <w:r>
         <w:rPr>
           <w:i/>
           <w:iCs/>
-          <w:highlight w:val="yellow"/>
-        </w:rPr>
-        <w:t>GroqCloud API documentation</w:t>
-      </w:r>
-      <w:r>
-        <w:rPr>
-          <w:highlight w:val="yellow"/>
-        </w:rPr>
-        <w:t>. https://console.groq.com/docs</w:t>
+        </w:rPr>
+        <w:t>arXiv preprint arXiv:2308.08155</w:t>
+      </w:r>
+      <w:r>
+        <w:t>.</w:t>
+      </w:r>
+    </w:p>
+    <w:p>
+      <w:pPr>
+        <w:pStyle w:val="BodyText"/>
+        <w:keepNext/>
+        <w:spacing w:before="200" w:after="80" w:line="276" w:lineRule="auto"/>
+      </w:pPr>
+      <w:r>
+        <w:rPr>
+          <w:b/>
+          <w:bCs/>
+          <w:highlight w:val="yellow"/>
+        </w:rPr>
+        <w:t>Conferences:</w:t>
       </w:r>
     </w:p>
     <w:p>
@@ -22167,7 +22198,7 @@
         <w:jc w:val="both"/>
       </w:pPr>
       <w:r>
-        <w:t xml:space="preserve">Lattner, C., &amp; Adve, V. (2004). LLVM: A compilation framework for lifelong program analysis &amp; transformation. </w:t>
+        <w:t xml:space="preserve">Cummins, C., Wasti, B., Guo, J., Cui, B., Ansel, J., Gomez, S., … &amp; Leather, H. (2022). CompilerGym: Robust, performant compiler optimization environments for AI research. </w:t>
       </w:r>
       <w:r>
         <w:rPr>
@@ -22177,7 +22208,7 @@
         <w:t>Proceedings of the IEEE/ACM International Symposium on Code Generation and Optimization (CGO)</w:t>
       </w:r>
       <w:r>
-        <w:t>, 75–86.</w:t>
+        <w:t>, 92–105.</w:t>
       </w:r>
     </w:p>
     <w:p>
@@ -22188,17 +22219,17 @@
         <w:jc w:val="both"/>
       </w:pPr>
       <w:r>
-        <w:t xml:space="preserve">Massalin, H. (1987). Superoptimizer: A look at the smallest program. </w:t>
+        <w:t xml:space="preserve">Lattner, C., &amp; Adve, V. (2004). LLVM: A compilation framework for lifelong program analysis &amp; transformation. </w:t>
       </w:r>
       <w:r>
         <w:rPr>
           <w:i/>
           <w:iCs/>
         </w:rPr>
-        <w:t>Proceedings of the 2nd International Conference on Architectural Support for Programming Languages and Operating Systems (ASPLOS)</w:t>
-      </w:r>
-      <w:r>
-        <w:t>, 122–126.</w:t>
+        <w:t>Proceedings of the IEEE/ACM International Symposium on Code Generation and Optimization (CGO)</w:t>
+      </w:r>
+      <w:r>
+        <w:t>, 75–86.</w:t>
       </w:r>
     </w:p>
     <w:p>
@@ -22209,17 +22240,17 @@
         <w:jc w:val="both"/>
       </w:pPr>
       <w:r>
-        <w:t xml:space="preserve">Muchnick, S. S. (1997). </w:t>
+        <w:t xml:space="preserve">Massalin, H. (1987). Superoptimizer: A look at the smallest program. </w:t>
       </w:r>
       <w:r>
         <w:rPr>
           <w:i/>
           <w:iCs/>
         </w:rPr>
-        <w:t>Advanced Compiler Design and Implementation</w:t>
-      </w:r>
-      <w:r>
-        <w:t>. Morgan Kaufmann.</w:t>
+        <w:t>Proceedings of the 2nd International Conference on Architectural Support for Programming Languages and Operating Systems (ASPLOS)</w:t>
+      </w:r>
+      <w:r>
+        <w:t>, 122–126.</w:t>
       </w:r>
     </w:p>
     <w:p>
@@ -22251,24 +22282,17 @@
         <w:jc w:val="both"/>
       </w:pPr>
       <w:r>
-        <w:rPr>
-          <w:highlight w:val="yellow"/>
-        </w:rPr>
-        <w:t xml:space="preserve">Ollama. (2026). </w:t>
+        <w:t xml:space="preserve">Phothilimthana, P. M., Thakur, A., Bodik, R., &amp; Dhurjati, D. (2016). Scaling up superoptimization. </w:t>
       </w:r>
       <w:r>
         <w:rPr>
           <w:i/>
           <w:iCs/>
-          <w:highlight w:val="yellow"/>
-        </w:rPr>
-        <w:t>Ollama: Run large language models locally</w:t>
-      </w:r>
-      <w:r>
-        <w:rPr>
-          <w:highlight w:val="yellow"/>
-        </w:rPr>
-        <w:t>. https://ollama.com</w:t>
+        </w:rPr>
+        <w:t>Proceedings of the 21st International Conference on Architectural Support for Programming Languages and Operating Systems (ASPLOS)</w:t>
+      </w:r>
+      <w:r>
+        <w:t>, 297–310.</w:t>
       </w:r>
     </w:p>
     <w:p>
@@ -22279,17 +22303,33 @@
         <w:jc w:val="both"/>
       </w:pPr>
       <w:r>
-        <w:t xml:space="preserve">Phothilimthana, P. M., Thakur, A., Bodik, R., &amp; Dhurjati, D. (2016). Scaling up superoptimization. </w:t>
+        <w:t xml:space="preserve">Pnueli, A., Siegel, M., &amp; Singerman, E. (1998). Translation validation. </w:t>
       </w:r>
       <w:r>
         <w:rPr>
           <w:i/>
           <w:iCs/>
         </w:rPr>
-        <w:t>Proceedings of the 21st International Conference on Architectural Support for Programming Languages and Operating Systems (ASPLOS)</w:t>
-      </w:r>
-      <w:r>
-        <w:t>, 297–310.</w:t>
+        <w:t>Proceedings of the International Conference on Tools and Algorithms for the Construction and Analysis of Systems (TACAS)</w:t>
+      </w:r>
+      <w:r>
+        <w:t>, 151–166.</w:t>
+      </w:r>
+    </w:p>
+    <w:p>
+      <w:pPr>
+        <w:pStyle w:val="BodyText"/>
+        <w:keepNext/>
+        <w:spacing w:before="200" w:after="80" w:line="276" w:lineRule="auto"/>
+      </w:pPr>
+      <w:r>
+        <w:rPr>
+          <w:b/>
+          <w:bCs/>
+          <w:highlight w:val="yellow"/>
+        </w:rPr>
+        <w:lastRenderedPageBreak/>
+        <w:t>Books:</w:t>
       </w:r>
     </w:p>
     <w:p>
@@ -22300,17 +22340,17 @@
         <w:jc w:val="both"/>
       </w:pPr>
       <w:r>
-        <w:t xml:space="preserve">Pnueli, A., Siegel, M., &amp; Singerman, E. (1998). Translation validation. </w:t>
+        <w:t xml:space="preserve">Aho, A. V., Lam, M. S., Sethi, R., &amp; Ullman, J. D. (2006). </w:t>
       </w:r>
       <w:r>
         <w:rPr>
           <w:i/>
           <w:iCs/>
         </w:rPr>
-        <w:t>Proceedings of the International Conference on Tools and Algorithms for the Construction and Analysis of Systems (TACAS)</w:t>
-      </w:r>
-      <w:r>
-        <w:t>, 151–166.</w:t>
+        <w:t>Compilers: Principles, Techniques, and Tools</w:t>
+      </w:r>
+      <w:r>
+        <w:t xml:space="preserve"> (2nd ed.). Pearson.</w:t>
       </w:r>
     </w:p>
     <w:p>
@@ -22321,17 +22361,17 @@
         <w:jc w:val="both"/>
       </w:pPr>
       <w:r>
-        <w:t xml:space="preserve">Rozière, B., Gehring, J., Gloeckle, F., Sootla, S., Gat, I., Tan, X. E., … &amp; Synnaeve, G. (2023). Code Llama: Open foundation models for code. </w:t>
+        <w:t xml:space="preserve">Muchnick, S. S. (1997). </w:t>
       </w:r>
       <w:r>
         <w:rPr>
           <w:i/>
           <w:iCs/>
         </w:rPr>
-        <w:t>arXiv preprint arXiv:2308.12950</w:t>
-      </w:r>
-      <w:r>
-        <w:t>.</w:t>
+        <w:t>Advanced Compiler Design and Implementation</w:t>
+      </w:r>
+      <w:r>
+        <w:t>. Morgan Kaufmann.</w:t>
       </w:r>
     </w:p>
     <w:p>
@@ -22342,7 +22382,6 @@
         <w:jc w:val="both"/>
       </w:pPr>
       <w:r>
-        <w:lastRenderedPageBreak/>
         <w:t xml:space="preserve">Stallman, R. M., &amp; the GCC Developer Community. (2023). </w:t>
       </w:r>
       <w:r>
@@ -22354,6 +22393,21 @@
       </w:r>
       <w:r>
         <w:t>. Free Software Foundation.</w:t>
+      </w:r>
+    </w:p>
+    <w:p>
+      <w:pPr>
+        <w:pStyle w:val="BodyText"/>
+        <w:keepNext/>
+        <w:spacing w:before="200" w:after="80" w:line="276" w:lineRule="auto"/>
+      </w:pPr>
+      <w:r>
+        <w:rPr>
+          <w:b/>
+          <w:bCs/>
+          <w:highlight w:val="yellow"/>
+        </w:rPr>
+        <w:t>Web links:</w:t>
       </w:r>
     </w:p>
     <w:p>
@@ -22364,17 +22418,52 @@
         <w:jc w:val="both"/>
       </w:pPr>
       <w:r>
-        <w:t xml:space="preserve">Wu, Q., Bansal, G., Zhang, J., Wu, Y., Li, B., Zhu, E., … &amp; Wang, C. (2023). AutoGen: Enabling next-gen LLM applications via multi-agent conversation. </w:t>
+        <w:rPr>
+          <w:highlight w:val="yellow"/>
+        </w:rPr>
+        <w:t xml:space="preserve">Groq. (2026). </w:t>
       </w:r>
       <w:r>
         <w:rPr>
           <w:i/>
           <w:iCs/>
-        </w:rPr>
-        <w:t>arXiv preprint arXiv:2308.08155</w:t>
-      </w:r>
-      <w:r>
-        <w:t>.</w:t>
+          <w:highlight w:val="yellow"/>
+        </w:rPr>
+        <w:t>GroqCloud API documentation</w:t>
+      </w:r>
+      <w:r>
+        <w:rPr>
+          <w:highlight w:val="yellow"/>
+        </w:rPr>
+        <w:t>. https://console.groq.com/docs</w:t>
+      </w:r>
+    </w:p>
+    <w:p>
+      <w:pPr>
+        <w:pStyle w:val="BodyText"/>
+        <w:spacing w:line="276" w:lineRule="auto"/>
+        <w:ind w:left="720" w:hanging="720"/>
+        <w:jc w:val="both"/>
+      </w:pPr>
+      <w:r>
+        <w:rPr>
+          <w:highlight w:val="yellow"/>
+        </w:rPr>
+        <w:t xml:space="preserve">Ollama. (2026). </w:t>
+      </w:r>
+      <w:r>
+        <w:rPr>
+          <w:i/>
+          <w:iCs/>
+          <w:highlight w:val="yellow"/>
+        </w:rPr>
+        <w:t>Ollama: Run large language models locally</w:t>
+      </w:r>
+      <w:r>
+        <w:rPr>
+          <w:highlight w:val="yellow"/>
+        </w:rPr>
+        <w:t>. https://ollama.com</w:t>
       </w:r>
     </w:p>
     <w:sectPr>
@@ -22469,7 +22558,7 @@
   <w:abstractNum w:abstractNumId="0" w15:restartNumberingAfterBreak="0">
     <w:nsid w:val="0000A990"/>
     <w:multiLevelType w:val="multilevel"/>
-    <w:tmpl w:val="9704EB84"/>
+    <w:tmpl w:val="F7D09794"/>
     <w:lvl w:ilvl="0">
       <w:numFmt w:val="bullet"/>
       <w:lvlText w:val=" "/>
@@ -22546,7 +22635,7 @@
   <w:abstractNum w:abstractNumId="1" w15:restartNumberingAfterBreak="0">
     <w:nsid w:val="0000A991"/>
     <w:multiLevelType w:val="multilevel"/>
-    <w:tmpl w:val="ED4E5F84"/>
+    <w:tmpl w:val="083E786E"/>
     <w:lvl w:ilvl="0">
       <w:numFmt w:val="bullet"/>
       <w:lvlText w:val=""/>
@@ -22650,7 +22739,7 @@
   <w:abstractNum w:abstractNumId="2" w15:restartNumberingAfterBreak="0">
     <w:nsid w:val="00A99201"/>
     <w:multiLevelType w:val="multilevel"/>
-    <w:tmpl w:val="8B0833E4"/>
+    <w:tmpl w:val="2A16167A"/>
     <w:lvl w:ilvl="0">
       <w:start w:val="1"/>
       <w:numFmt w:val="decimal"/>
@@ -22733,16 +22822,16 @@
       </w:pPr>
     </w:lvl>
   </w:abstractNum>
-  <w:num w:numId="1" w16cid:durableId="1203397291">
+  <w:num w:numId="1" w16cid:durableId="1164778595">
     <w:abstractNumId w:val="0"/>
   </w:num>
-  <w:num w:numId="2" w16cid:durableId="415203206">
+  <w:num w:numId="2" w16cid:durableId="965354432">
     <w:abstractNumId w:val="1"/>
   </w:num>
-  <w:num w:numId="3" w16cid:durableId="72974046">
+  <w:num w:numId="3" w16cid:durableId="232469202">
     <w:abstractNumId w:val="1"/>
   </w:num>
-  <w:num w:numId="4" w16cid:durableId="700595001">
+  <w:num w:numId="4" w16cid:durableId="274948859">
     <w:abstractNumId w:val="2"/>
     <w:lvlOverride w:ilvl="0">
       <w:startOverride w:val="1"/>
@@ -22772,7 +22861,7 @@
       <w:startOverride w:val="1"/>
     </w:lvlOverride>
   </w:num>
-  <w:num w:numId="5" w16cid:durableId="1264264505">
+  <w:num w:numId="5" w16cid:durableId="1007290201">
     <w:abstractNumId w:val="2"/>
     <w:lvlOverride w:ilvl="0">
       <w:startOverride w:val="1"/>
@@ -22802,7 +22891,7 @@
       <w:startOverride w:val="1"/>
     </w:lvlOverride>
   </w:num>
-  <w:num w:numId="6" w16cid:durableId="621427096">
+  <w:num w:numId="6" w16cid:durableId="330372545">
     <w:abstractNumId w:val="2"/>
     <w:lvlOverride w:ilvl="0">
       <w:startOverride w:val="1"/>
@@ -22832,7 +22921,7 @@
       <w:startOverride w:val="1"/>
     </w:lvlOverride>
   </w:num>
-  <w:num w:numId="7" w16cid:durableId="349920477">
+  <w:num w:numId="7" w16cid:durableId="1348601682">
     <w:abstractNumId w:val="2"/>
     <w:lvlOverride w:ilvl="0">
       <w:startOverride w:val="1"/>
@@ -22862,13 +22951,13 @@
       <w:startOverride w:val="1"/>
     </w:lvlOverride>
   </w:num>
-  <w:num w:numId="8" w16cid:durableId="107283990">
+  <w:num w:numId="8" w16cid:durableId="333411566">
     <w:abstractNumId w:val="1"/>
   </w:num>
-  <w:num w:numId="9" w16cid:durableId="2029284047">
+  <w:num w:numId="9" w16cid:durableId="1147236463">
     <w:abstractNumId w:val="1"/>
   </w:num>
-  <w:num w:numId="10" w16cid:durableId="1331441829">
+  <w:num w:numId="10" w16cid:durableId="473065381">
     <w:abstractNumId w:val="1"/>
   </w:num>
 </w:numbering>
@@ -24102,7 +24191,7 @@
     <w:next w:val="Normal"/>
     <w:autoRedefine/>
     <w:uiPriority w:val="39"/>
-    <w:rsid w:val="008948A3"/>
+    <w:rsid w:val="004B10AE"/>
     <w:pPr>
       <w:spacing w:after="100"/>
     </w:pPr>
@@ -24113,7 +24202,7 @@
     <w:next w:val="Normal"/>
     <w:autoRedefine/>
     <w:uiPriority w:val="39"/>
-    <w:rsid w:val="008948A3"/>
+    <w:rsid w:val="004B10AE"/>
     <w:pPr>
       <w:spacing w:after="100"/>
       <w:ind w:left="240"/>
@@ -24125,7 +24214,7 @@
     <w:next w:val="Normal"/>
     <w:autoRedefine/>
     <w:uiPriority w:val="39"/>
-    <w:rsid w:val="008948A3"/>
+    <w:rsid w:val="004B10AE"/>
     <w:pPr>
       <w:spacing w:after="100"/>
       <w:ind w:left="480"/>

</xml_diff>